<commit_message>
upload the version 4 of the proposal adjusting formating and pages
</commit_message>
<xml_diff>
--- a/230482_CA1_Strategic_Thinking_Final_Fix 1021.docx
+++ b/230482_CA1_Strategic_Thinking_Final_Fix 1021.docx
@@ -2,6 +2,7 @@
 <file path=word/document.xml><?xml version="1.0" encoding="utf-8"?>
 <w:document xmlns:wpc="http://schemas.microsoft.com/office/word/2010/wordprocessingCanvas" xmlns:cx="http://schemas.microsoft.com/office/drawing/2014/chartex" xmlns:cx1="http://schemas.microsoft.com/office/drawing/2015/9/8/chartex" xmlns:cx2="http://schemas.microsoft.com/office/drawing/2015/10/21/chartex" xmlns:cx3="http://schemas.microsoft.com/office/drawing/2016/5/9/chartex" xmlns:cx4="http://schemas.microsoft.com/office/drawing/2016/5/10/chartex" xmlns:cx5="http://schemas.microsoft.com/office/drawing/2016/5/11/chartex" xmlns:cx6="http://schemas.microsoft.com/office/drawing/2016/5/12/chartex" xmlns:cx7="http://schemas.microsoft.com/office/drawing/2016/5/13/chartex" xmlns:cx8="http://schemas.microsoft.com/office/drawing/2016/5/14/chartex" xmlns:mc="http://schemas.openxmlformats.org/markup-compatibility/2006" xmlns:aink="http://schemas.microsoft.com/office/drawing/2016/ink" xmlns:am3d="http://schemas.microsoft.com/office/drawing/2017/model3d" xmlns:o="urn:schemas-microsoft-com:office:office" xmlns:oel="http://schemas.microsoft.com/office/2019/extlst" xmlns:r="http://schemas.openxmlformats.org/officeDocument/2006/relationships" xmlns:m="http://schemas.openxmlformats.org/officeDocument/2006/math" xmlns:v="urn:schemas-microsoft-com:vml" xmlns:wp14="http://schemas.microsoft.com/office/word/2010/wordprocessingDrawing" xmlns:wp="http://schemas.openxmlformats.org/drawingml/2006/wordprocessingDrawing" xmlns:w10="urn:schemas-microsoft-com:office:word" xmlns:w="http://schemas.openxmlformats.org/wordprocessingml/2006/main" xmlns:w14="http://schemas.microsoft.com/office/word/2010/wordml" xmlns:w15="http://schemas.microsoft.com/office/word/2012/wordml" xmlns:w16cex="http://schemas.microsoft.com/office/word/2018/wordml/cex" xmlns:w16cid="http://schemas.microsoft.com/office/word/2016/wordml/cid" xmlns:w16="http://schemas.microsoft.com/office/word/2018/wordml" xmlns:w16sdtdh="http://schemas.microsoft.com/office/word/2020/wordml/sdtdatahash" xmlns:w16se="http://schemas.microsoft.com/office/word/2015/wordml/symex" xmlns:wpg="http://schemas.microsoft.com/office/word/2010/wordprocessingGroup" xmlns:wpi="http://schemas.microsoft.com/office/word/2010/wordprocessingInk" xmlns:wne="http://schemas.microsoft.com/office/word/2006/wordml" xmlns:wps="http://schemas.microsoft.com/office/word/2010/wordprocessingShape" mc:Ignorable="w14 w15 w16se w16cid w16 w16cex w16sdtdh wp14">
   <w:body>
+    <w:bookmarkStart w:id="0" w:name="_Toc243498872"/>
     <w:p>
       <w:pPr>
         <w:pStyle w:val="Heading1"/>
@@ -9,7 +10,6 @@
           <w:rFonts w:ascii="Times New Roman" w:hAnsi="Times New Roman" w:cs="Times New Roman"/>
         </w:rPr>
       </w:pPr>
-      <w:bookmarkStart w:id="0" w:name="_Toc243498872"/>
       <w:r>
         <w:rPr>
           <w:rFonts w:ascii="Times New Roman" w:hAnsi="Times New Roman" w:cs="Times New Roman"/>
@@ -77,7 +77,7 @@
                                   <w:spacing w:after="0" w:line="240" w:lineRule="auto"/>
                                   <w:textDirection w:val="btLr"/>
                                   <w:rPr>
-                                    <w:rFonts w:eastAsia="SimSun" w:hint="eastAsia"/>
+                                    <w:rFonts w:eastAsia="SimSun"/>
                                     <w:lang w:eastAsia="zh-CN"/>
                                   </w:rPr>
                                 </w:pPr>
@@ -115,7 +115,7 @@
                                   <w:spacing w:after="0" w:line="240" w:lineRule="auto"/>
                                   <w:textDirection w:val="btLr"/>
                                   <w:rPr>
-                                    <w:rFonts w:eastAsia="SimSun" w:hint="eastAsia"/>
+                                    <w:rFonts w:eastAsia="SimSun"/>
                                     <w:lang w:eastAsia="zh-CN"/>
                                   </w:rPr>
                                 </w:pPr>
@@ -182,7 +182,7 @@
                             <w:spacing w:after="0" w:line="240" w:lineRule="auto"/>
                             <w:textDirection w:val="btLr"/>
                             <w:rPr>
-                              <w:rFonts w:eastAsia="SimSun" w:hint="eastAsia"/>
+                              <w:rFonts w:eastAsia="SimSun"/>
                               <w:lang w:eastAsia="zh-CN"/>
                             </w:rPr>
                           </w:pPr>
@@ -198,7 +198,7 @@
                             <w:spacing w:after="0" w:line="240" w:lineRule="auto"/>
                             <w:textDirection w:val="btLr"/>
                             <w:rPr>
-                              <w:rFonts w:eastAsia="SimSun" w:hint="eastAsia"/>
+                              <w:rFonts w:eastAsia="SimSun"/>
                               <w:lang w:eastAsia="zh-CN"/>
                             </w:rPr>
                           </w:pPr>
@@ -479,7 +479,7 @@
           <w:p>
             <w:pPr>
               <w:rPr>
-                <w:rFonts w:ascii="Times New Roman" w:eastAsia="SimSun" w:hAnsi="Times New Roman" w:cs="Times New Roman" w:hint="eastAsia"/>
+                <w:rFonts w:ascii="Times New Roman" w:eastAsia="SimSun" w:hAnsi="Times New Roman" w:cs="Times New Roman"/>
                 <w:b/>
                 <w:bCs/>
                 <w:i/>
@@ -649,7 +649,6 @@
               </w:rPr>
               <w:t>Analytics for Labor Optimization in Hospitality I</w:t>
             </w:r>
-            <w:proofErr w:type="spellStart"/>
             <w:r>
               <w:rPr>
                 <w:rFonts w:ascii="Times New Roman" w:hAnsi="Times New Roman" w:cs="Times New Roman"/>
@@ -661,7 +660,6 @@
               </w:rPr>
               <w:t>ndustry</w:t>
             </w:r>
-            <w:proofErr w:type="spellEnd"/>
           </w:p>
           <w:p>
             <w:pPr>
@@ -754,7 +752,6 @@
                 <w:u w:val="single"/>
               </w:rPr>
             </w:pPr>
-            <w:proofErr w:type="spellStart"/>
             <w:r>
               <w:rPr>
                 <w:rFonts w:ascii="Times New Roman" w:hAnsi="Times New Roman" w:cs="Times New Roman"/>
@@ -763,18 +760,7 @@
                 <w:szCs w:val="28"/>
                 <w:u w:val="single"/>
               </w:rPr>
-              <w:t>Taufique</w:t>
-            </w:r>
-            <w:proofErr w:type="spellEnd"/>
-            <w:r>
-              <w:rPr>
-                <w:rFonts w:ascii="Times New Roman" w:hAnsi="Times New Roman" w:cs="Times New Roman"/>
-                <w:i/>
-                <w:sz w:val="28"/>
-                <w:szCs w:val="28"/>
-                <w:u w:val="single"/>
-              </w:rPr>
-              <w:t xml:space="preserve"> Ahmed</w:t>
+              <w:t>Taufique Ahmed</w:t>
             </w:r>
           </w:p>
         </w:tc>
@@ -996,7 +982,7 @@
           <w:p>
             <w:pPr>
               <w:rPr>
-                <w:rFonts w:ascii="Times New Roman" w:eastAsia="SimSun" w:hAnsi="Times New Roman" w:cs="Times New Roman" w:hint="eastAsia"/>
+                <w:rFonts w:ascii="Times New Roman" w:eastAsia="SimSun" w:hAnsi="Times New Roman" w:cs="Times New Roman"/>
                 <w:i/>
                 <w:color w:val="156082"/>
                 <w:sz w:val="32"/>
@@ -1162,7 +1148,12 @@
     <w:sdt>
       <w:sdtPr>
         <w:rPr>
-          <w:rFonts w:ascii="Times New Roman" w:hAnsi="Times New Roman" w:cs="Times New Roman"/>
+          <w:rFonts w:ascii="Times New Roman" w:eastAsiaTheme="minorEastAsia" w:hAnsi="Times New Roman" w:cs="Times New Roman"/>
+          <w:b w:val="0"/>
+          <w:bCs w:val="0"/>
+          <w:color w:val="auto"/>
+          <w:sz w:val="22"/>
+          <w:szCs w:val="22"/>
         </w:rPr>
         <w:id w:val="81189173"/>
         <w:docPartObj>
@@ -1172,11 +1163,7 @@
       </w:sdtPr>
       <w:sdtEndPr>
         <w:rPr>
-          <w:rFonts w:eastAsiaTheme="minorEastAsia"/>
           <w:noProof/>
-          <w:color w:val="auto"/>
-          <w:sz w:val="22"/>
-          <w:szCs w:val="22"/>
         </w:rPr>
       </w:sdtEndPr>
       <w:sdtContent>
@@ -1204,7 +1191,7 @@
             <w:pStyle w:val="TOC1"/>
             <w:spacing w:line="360" w:lineRule="auto"/>
             <w:rPr>
-              <w:rFonts w:eastAsia="SimSun" w:hint="eastAsia"/>
+              <w:rFonts w:eastAsia="SimSun"/>
               <w:noProof/>
               <w:lang w:eastAsia="zh-CN"/>
             </w:rPr>
@@ -1617,8 +1604,9 @@
             </w:tabs>
             <w:spacing w:line="360" w:lineRule="auto"/>
             <w:rPr>
-              <w:rFonts w:ascii="Times New Roman" w:hAnsi="Times New Roman" w:cs="Times New Roman"/>
+              <w:rFonts w:ascii="Times New Roman" w:eastAsia="SimSun" w:hAnsi="Times New Roman" w:cs="Times New Roman"/>
               <w:noProof/>
+              <w:lang w:eastAsia="zh-CN"/>
             </w:rPr>
           </w:pPr>
           <w:hyperlink w:anchor="_Toc243498880" w:history="1">
@@ -1640,50 +1628,12 @@
             </w:r>
             <w:r>
               <w:rPr>
-                <w:rFonts w:ascii="Times New Roman" w:hAnsi="Times New Roman" w:cs="Times New Roman"/>
+                <w:rFonts w:ascii="Times New Roman" w:eastAsia="SimSun" w:hAnsi="Times New Roman" w:cs="Times New Roman" w:hint="eastAsia"/>
                 <w:noProof/>
                 <w:webHidden/>
-              </w:rPr>
-              <w:fldChar w:fldCharType="begin"/>
-            </w:r>
-            <w:r>
-              <w:rPr>
-                <w:rFonts w:ascii="Times New Roman" w:hAnsi="Times New Roman" w:cs="Times New Roman"/>
-                <w:noProof/>
-                <w:webHidden/>
-              </w:rPr>
-              <w:instrText xml:space="preserve"> PAGEREF _Toc243498880 \h </w:instrText>
-            </w:r>
-            <w:r>
-              <w:rPr>
-                <w:rFonts w:ascii="Times New Roman" w:hAnsi="Times New Roman" w:cs="Times New Roman"/>
-                <w:noProof/>
-                <w:webHidden/>
-              </w:rPr>
-            </w:r>
-            <w:r>
-              <w:rPr>
-                <w:rFonts w:ascii="Times New Roman" w:hAnsi="Times New Roman" w:cs="Times New Roman"/>
-                <w:noProof/>
-                <w:webHidden/>
-              </w:rPr>
-              <w:fldChar w:fldCharType="separate"/>
-            </w:r>
-            <w:r>
-              <w:rPr>
-                <w:rFonts w:ascii="Times New Roman" w:hAnsi="Times New Roman" w:cs="Times New Roman"/>
-                <w:noProof/>
-                <w:webHidden/>
-              </w:rPr>
-              <w:t>2</w:t>
-            </w:r>
-            <w:r>
-              <w:rPr>
-                <w:rFonts w:ascii="Times New Roman" w:hAnsi="Times New Roman" w:cs="Times New Roman"/>
-                <w:noProof/>
-                <w:webHidden/>
-              </w:rPr>
-              <w:fldChar w:fldCharType="end"/>
+                <w:lang w:eastAsia="zh-CN"/>
+              </w:rPr>
+              <w:t>1</w:t>
             </w:r>
           </w:hyperlink>
         </w:p>
@@ -1718,50 +1668,12 @@
             </w:r>
             <w:r>
               <w:rPr>
-                <w:rFonts w:ascii="Times New Roman" w:hAnsi="Times New Roman" w:cs="Times New Roman"/>
+                <w:rFonts w:ascii="Times New Roman" w:eastAsia="SimSun" w:hAnsi="Times New Roman" w:cs="Times New Roman" w:hint="eastAsia"/>
                 <w:noProof/>
                 <w:webHidden/>
-              </w:rPr>
-              <w:fldChar w:fldCharType="begin"/>
-            </w:r>
-            <w:r>
-              <w:rPr>
-                <w:rFonts w:ascii="Times New Roman" w:hAnsi="Times New Roman" w:cs="Times New Roman"/>
-                <w:noProof/>
-                <w:webHidden/>
-              </w:rPr>
-              <w:instrText xml:space="preserve"> PAGEREF _Toc243498881 \h </w:instrText>
-            </w:r>
-            <w:r>
-              <w:rPr>
-                <w:rFonts w:ascii="Times New Roman" w:hAnsi="Times New Roman" w:cs="Times New Roman"/>
-                <w:noProof/>
-                <w:webHidden/>
-              </w:rPr>
-            </w:r>
-            <w:r>
-              <w:rPr>
-                <w:rFonts w:ascii="Times New Roman" w:hAnsi="Times New Roman" w:cs="Times New Roman"/>
-                <w:noProof/>
-                <w:webHidden/>
-              </w:rPr>
-              <w:fldChar w:fldCharType="separate"/>
-            </w:r>
-            <w:r>
-              <w:rPr>
-                <w:rFonts w:ascii="Times New Roman" w:hAnsi="Times New Roman" w:cs="Times New Roman"/>
-                <w:noProof/>
-                <w:webHidden/>
-              </w:rPr>
-              <w:t>2</w:t>
-            </w:r>
-            <w:r>
-              <w:rPr>
-                <w:rFonts w:ascii="Times New Roman" w:hAnsi="Times New Roman" w:cs="Times New Roman"/>
-                <w:noProof/>
-                <w:webHidden/>
-              </w:rPr>
-              <w:fldChar w:fldCharType="end"/>
+                <w:lang w:eastAsia="zh-CN"/>
+              </w:rPr>
+              <w:t>1</w:t>
             </w:r>
           </w:hyperlink>
         </w:p>
@@ -2163,7 +2075,7 @@
             </w:tabs>
             <w:spacing w:line="360" w:lineRule="auto"/>
             <w:rPr>
-              <w:rFonts w:ascii="Times New Roman" w:eastAsia="SimSun" w:hAnsi="Times New Roman" w:cs="Times New Roman" w:hint="eastAsia"/>
+              <w:rFonts w:ascii="Times New Roman" w:eastAsia="SimSun" w:hAnsi="Times New Roman" w:cs="Times New Roman"/>
               <w:noProof/>
               <w:lang w:eastAsia="zh-CN"/>
             </w:rPr>
@@ -2227,50 +2139,12 @@
             </w:r>
             <w:r>
               <w:rPr>
-                <w:rFonts w:ascii="Times New Roman" w:hAnsi="Times New Roman" w:cs="Times New Roman"/>
+                <w:rFonts w:ascii="Times New Roman" w:eastAsia="SimSun" w:hAnsi="Times New Roman" w:cs="Times New Roman" w:hint="eastAsia"/>
                 <w:noProof/>
                 <w:webHidden/>
-              </w:rPr>
-              <w:fldChar w:fldCharType="begin"/>
-            </w:r>
-            <w:r>
-              <w:rPr>
-                <w:rFonts w:ascii="Times New Roman" w:hAnsi="Times New Roman" w:cs="Times New Roman"/>
-                <w:noProof/>
-                <w:webHidden/>
-              </w:rPr>
-              <w:instrText xml:space="preserve"> PAGEREF _Toc243498888 \h </w:instrText>
-            </w:r>
-            <w:r>
-              <w:rPr>
-                <w:rFonts w:ascii="Times New Roman" w:hAnsi="Times New Roman" w:cs="Times New Roman"/>
-                <w:noProof/>
-                <w:webHidden/>
-              </w:rPr>
-            </w:r>
-            <w:r>
-              <w:rPr>
-                <w:rFonts w:ascii="Times New Roman" w:hAnsi="Times New Roman" w:cs="Times New Roman"/>
-                <w:noProof/>
-                <w:webHidden/>
-              </w:rPr>
-              <w:fldChar w:fldCharType="separate"/>
-            </w:r>
-            <w:r>
-              <w:rPr>
-                <w:rFonts w:ascii="Times New Roman" w:hAnsi="Times New Roman" w:cs="Times New Roman"/>
-                <w:noProof/>
-                <w:webHidden/>
+                <w:lang w:eastAsia="zh-CN"/>
               </w:rPr>
               <w:t>3</w:t>
-            </w:r>
-            <w:r>
-              <w:rPr>
-                <w:rFonts w:ascii="Times New Roman" w:hAnsi="Times New Roman" w:cs="Times New Roman"/>
-                <w:noProof/>
-                <w:webHidden/>
-              </w:rPr>
-              <w:fldChar w:fldCharType="end"/>
             </w:r>
           </w:hyperlink>
         </w:p>
@@ -2934,7 +2808,7 @@
                 <w:webHidden/>
                 <w:lang w:eastAsia="zh-CN"/>
               </w:rPr>
-              <w:t>3</w:t>
+              <w:t>4</w:t>
             </w:r>
           </w:hyperlink>
         </w:p>
@@ -2974,7 +2848,7 @@
                 <w:webHidden/>
                 <w:lang w:eastAsia="zh-CN"/>
               </w:rPr>
-              <w:t>3</w:t>
+              <w:t>4</w:t>
             </w:r>
           </w:hyperlink>
         </w:p>
@@ -3014,7 +2888,7 @@
                 <w:webHidden/>
                 <w:lang w:eastAsia="zh-CN"/>
               </w:rPr>
-              <w:t>3</w:t>
+              <w:t>4</w:t>
             </w:r>
           </w:hyperlink>
         </w:p>
@@ -3049,50 +2923,12 @@
             </w:r>
             <w:r>
               <w:rPr>
-                <w:rFonts w:ascii="Times New Roman" w:hAnsi="Times New Roman" w:cs="Times New Roman"/>
+                <w:rFonts w:ascii="Times New Roman" w:eastAsia="SimSun" w:hAnsi="Times New Roman" w:cs="Times New Roman" w:hint="eastAsia"/>
                 <w:noProof/>
                 <w:webHidden/>
-              </w:rPr>
-              <w:fldChar w:fldCharType="begin"/>
-            </w:r>
-            <w:r>
-              <w:rPr>
-                <w:rFonts w:ascii="Times New Roman" w:hAnsi="Times New Roman" w:cs="Times New Roman"/>
-                <w:noProof/>
-                <w:webHidden/>
-              </w:rPr>
-              <w:instrText xml:space="preserve"> PAGEREF _Toc243498900 \h </w:instrText>
-            </w:r>
-            <w:r>
-              <w:rPr>
-                <w:rFonts w:ascii="Times New Roman" w:hAnsi="Times New Roman" w:cs="Times New Roman"/>
-                <w:noProof/>
-                <w:webHidden/>
-              </w:rPr>
-            </w:r>
-            <w:r>
-              <w:rPr>
-                <w:rFonts w:ascii="Times New Roman" w:hAnsi="Times New Roman" w:cs="Times New Roman"/>
-                <w:noProof/>
-                <w:webHidden/>
-              </w:rPr>
-              <w:fldChar w:fldCharType="separate"/>
-            </w:r>
-            <w:r>
-              <w:rPr>
-                <w:rFonts w:ascii="Times New Roman" w:hAnsi="Times New Roman" w:cs="Times New Roman"/>
-                <w:noProof/>
-                <w:webHidden/>
+                <w:lang w:eastAsia="zh-CN"/>
               </w:rPr>
               <w:t>4</w:t>
-            </w:r>
-            <w:r>
-              <w:rPr>
-                <w:rFonts w:ascii="Times New Roman" w:hAnsi="Times New Roman" w:cs="Times New Roman"/>
-                <w:noProof/>
-                <w:webHidden/>
-              </w:rPr>
-              <w:fldChar w:fldCharType="end"/>
             </w:r>
           </w:hyperlink>
         </w:p>
@@ -3104,8 +2940,9 @@
             </w:tabs>
             <w:spacing w:line="360" w:lineRule="auto"/>
             <w:rPr>
-              <w:rFonts w:ascii="Times New Roman" w:hAnsi="Times New Roman" w:cs="Times New Roman"/>
+              <w:rFonts w:ascii="Times New Roman" w:eastAsia="SimSun" w:hAnsi="Times New Roman" w:cs="Times New Roman"/>
               <w:noProof/>
+              <w:lang w:eastAsia="zh-CN"/>
             </w:rPr>
           </w:pPr>
           <w:hyperlink w:anchor="_Toc243498901" w:history="1">
@@ -3127,50 +2964,12 @@
             </w:r>
             <w:r>
               <w:rPr>
-                <w:rFonts w:ascii="Times New Roman" w:hAnsi="Times New Roman" w:cs="Times New Roman"/>
+                <w:rFonts w:ascii="Times New Roman" w:eastAsia="SimSun" w:hAnsi="Times New Roman" w:cs="Times New Roman" w:hint="eastAsia"/>
                 <w:noProof/>
                 <w:webHidden/>
-              </w:rPr>
-              <w:fldChar w:fldCharType="begin"/>
-            </w:r>
-            <w:r>
-              <w:rPr>
-                <w:rFonts w:ascii="Times New Roman" w:hAnsi="Times New Roman" w:cs="Times New Roman"/>
-                <w:noProof/>
-                <w:webHidden/>
-              </w:rPr>
-              <w:instrText xml:space="preserve"> PAGEREF _Toc243498901 \h </w:instrText>
-            </w:r>
-            <w:r>
-              <w:rPr>
-                <w:rFonts w:ascii="Times New Roman" w:hAnsi="Times New Roman" w:cs="Times New Roman"/>
-                <w:noProof/>
-                <w:webHidden/>
-              </w:rPr>
-            </w:r>
-            <w:r>
-              <w:rPr>
-                <w:rFonts w:ascii="Times New Roman" w:hAnsi="Times New Roman" w:cs="Times New Roman"/>
-                <w:noProof/>
-                <w:webHidden/>
-              </w:rPr>
-              <w:fldChar w:fldCharType="separate"/>
-            </w:r>
-            <w:r>
-              <w:rPr>
-                <w:rFonts w:ascii="Times New Roman" w:hAnsi="Times New Roman" w:cs="Times New Roman"/>
-                <w:noProof/>
-                <w:webHidden/>
+                <w:lang w:eastAsia="zh-CN"/>
               </w:rPr>
               <w:t>4</w:t>
-            </w:r>
-            <w:r>
-              <w:rPr>
-                <w:rFonts w:ascii="Times New Roman" w:hAnsi="Times New Roman" w:cs="Times New Roman"/>
-                <w:noProof/>
-                <w:webHidden/>
-              </w:rPr>
-              <w:fldChar w:fldCharType="end"/>
             </w:r>
           </w:hyperlink>
         </w:p>
@@ -3361,50 +3160,12 @@
             </w:r>
             <w:r>
               <w:rPr>
-                <w:rFonts w:ascii="Times New Roman" w:hAnsi="Times New Roman" w:cs="Times New Roman"/>
+                <w:rFonts w:ascii="Times New Roman" w:eastAsia="SimSun" w:hAnsi="Times New Roman" w:cs="Times New Roman" w:hint="eastAsia"/>
                 <w:noProof/>
                 <w:webHidden/>
-              </w:rPr>
-              <w:fldChar w:fldCharType="begin"/>
-            </w:r>
-            <w:r>
-              <w:rPr>
-                <w:rFonts w:ascii="Times New Roman" w:hAnsi="Times New Roman" w:cs="Times New Roman"/>
-                <w:noProof/>
-                <w:webHidden/>
-              </w:rPr>
-              <w:instrText xml:space="preserve"> PAGEREF _Toc243498904 \h </w:instrText>
-            </w:r>
-            <w:r>
-              <w:rPr>
-                <w:rFonts w:ascii="Times New Roman" w:hAnsi="Times New Roman" w:cs="Times New Roman"/>
-                <w:noProof/>
-                <w:webHidden/>
-              </w:rPr>
-            </w:r>
-            <w:r>
-              <w:rPr>
-                <w:rFonts w:ascii="Times New Roman" w:hAnsi="Times New Roman" w:cs="Times New Roman"/>
-                <w:noProof/>
-                <w:webHidden/>
-              </w:rPr>
-              <w:fldChar w:fldCharType="separate"/>
-            </w:r>
-            <w:r>
-              <w:rPr>
-                <w:rFonts w:ascii="Times New Roman" w:hAnsi="Times New Roman" w:cs="Times New Roman"/>
-                <w:noProof/>
-                <w:webHidden/>
-              </w:rPr>
-              <w:t>4</w:t>
-            </w:r>
-            <w:r>
-              <w:rPr>
-                <w:rFonts w:ascii="Times New Roman" w:hAnsi="Times New Roman" w:cs="Times New Roman"/>
-                <w:noProof/>
-                <w:webHidden/>
-              </w:rPr>
-              <w:fldChar w:fldCharType="end"/>
+                <w:lang w:eastAsia="zh-CN"/>
+              </w:rPr>
+              <w:t>5</w:t>
             </w:r>
           </w:hyperlink>
         </w:p>
@@ -3434,44 +3195,12 @@
             </w:r>
             <w:r>
               <w:rPr>
+                <w:rFonts w:eastAsia="SimSun" w:hint="eastAsia"/>
                 <w:noProof/>
                 <w:webHidden/>
-              </w:rPr>
-              <w:fldChar w:fldCharType="begin"/>
-            </w:r>
-            <w:r>
-              <w:rPr>
-                <w:noProof/>
-                <w:webHidden/>
-              </w:rPr>
-              <w:instrText xml:space="preserve"> PAGEREF _Toc243498905 \h </w:instrText>
-            </w:r>
-            <w:r>
-              <w:rPr>
-                <w:noProof/>
-                <w:webHidden/>
-              </w:rPr>
-            </w:r>
-            <w:r>
-              <w:rPr>
-                <w:noProof/>
-                <w:webHidden/>
-              </w:rPr>
-              <w:fldChar w:fldCharType="separate"/>
-            </w:r>
-            <w:r>
-              <w:rPr>
-                <w:noProof/>
-                <w:webHidden/>
-              </w:rPr>
-              <w:t>5</w:t>
-            </w:r>
-            <w:r>
-              <w:rPr>
-                <w:noProof/>
-                <w:webHidden/>
-              </w:rPr>
-              <w:fldChar w:fldCharType="end"/>
+                <w:lang w:eastAsia="zh-CN"/>
+              </w:rPr>
+              <w:t>6</w:t>
             </w:r>
           </w:hyperlink>
         </w:p>
@@ -3501,44 +3230,12 @@
             </w:r>
             <w:r>
               <w:rPr>
+                <w:rFonts w:eastAsia="SimSun" w:hint="eastAsia"/>
                 <w:noProof/>
                 <w:webHidden/>
-              </w:rPr>
-              <w:fldChar w:fldCharType="begin"/>
-            </w:r>
-            <w:r>
-              <w:rPr>
-                <w:noProof/>
-                <w:webHidden/>
-              </w:rPr>
-              <w:instrText xml:space="preserve"> PAGEREF _Toc243498906 \h </w:instrText>
-            </w:r>
-            <w:r>
-              <w:rPr>
-                <w:noProof/>
-                <w:webHidden/>
-              </w:rPr>
-            </w:r>
-            <w:r>
-              <w:rPr>
-                <w:noProof/>
-                <w:webHidden/>
-              </w:rPr>
-              <w:fldChar w:fldCharType="separate"/>
-            </w:r>
-            <w:r>
-              <w:rPr>
-                <w:noProof/>
-                <w:webHidden/>
-              </w:rPr>
-              <w:t>6</w:t>
-            </w:r>
-            <w:r>
-              <w:rPr>
-                <w:noProof/>
-                <w:webHidden/>
-              </w:rPr>
-              <w:fldChar w:fldCharType="end"/>
+                <w:lang w:eastAsia="zh-CN"/>
+              </w:rPr>
+              <w:t>7</w:t>
             </w:r>
           </w:hyperlink>
         </w:p>
@@ -3550,8 +3247,9 @@
             </w:tabs>
             <w:spacing w:line="360" w:lineRule="auto"/>
             <w:rPr>
-              <w:rFonts w:ascii="Times New Roman" w:hAnsi="Times New Roman" w:cs="Times New Roman"/>
+              <w:rFonts w:ascii="Times New Roman" w:eastAsia="SimSun" w:hAnsi="Times New Roman" w:cs="Times New Roman"/>
               <w:noProof/>
+              <w:lang w:eastAsia="zh-CN"/>
             </w:rPr>
           </w:pPr>
           <w:hyperlink w:anchor="_Toc243498907" w:history="1">
@@ -3619,162 +3317,14 @@
               <w:fldChar w:fldCharType="end"/>
             </w:r>
           </w:hyperlink>
-        </w:p>
-        <w:p>
-          <w:pPr>
-            <w:pStyle w:val="TOC2"/>
-            <w:tabs>
-              <w:tab w:val="right" w:leader="dot" w:pos="8636"/>
-            </w:tabs>
-            <w:spacing w:line="360" w:lineRule="auto"/>
+          <w:r>
             <w:rPr>
-              <w:rFonts w:ascii="Times New Roman" w:hAnsi="Times New Roman" w:cs="Times New Roman"/>
+              <w:rFonts w:ascii="Times New Roman" w:eastAsia="SimSun" w:hAnsi="Times New Roman" w:cs="Times New Roman" w:hint="eastAsia"/>
               <w:noProof/>
+              <w:lang w:eastAsia="zh-CN"/>
             </w:rPr>
-          </w:pPr>
-          <w:hyperlink w:anchor="_Toc243498908" w:history="1">
-            <w:r>
-              <w:rPr>
-                <w:rStyle w:val="Hyperlink"/>
-                <w:rFonts w:ascii="Times New Roman" w:hAnsi="Times New Roman" w:cs="Times New Roman"/>
-                <w:noProof/>
-              </w:rPr>
-              <w:t>Declaration</w:t>
-            </w:r>
-            <w:r>
-              <w:rPr>
-                <w:rFonts w:ascii="Times New Roman" w:hAnsi="Times New Roman" w:cs="Times New Roman"/>
-                <w:noProof/>
-                <w:webHidden/>
-              </w:rPr>
-              <w:tab/>
-            </w:r>
-            <w:r>
-              <w:rPr>
-                <w:rFonts w:ascii="Times New Roman" w:hAnsi="Times New Roman" w:cs="Times New Roman"/>
-                <w:noProof/>
-                <w:webHidden/>
-              </w:rPr>
-              <w:fldChar w:fldCharType="begin"/>
-            </w:r>
-            <w:r>
-              <w:rPr>
-                <w:rFonts w:ascii="Times New Roman" w:hAnsi="Times New Roman" w:cs="Times New Roman"/>
-                <w:noProof/>
-                <w:webHidden/>
-              </w:rPr>
-              <w:instrText xml:space="preserve"> PAGEREF _Toc243498908 \h </w:instrText>
-            </w:r>
-            <w:r>
-              <w:rPr>
-                <w:rFonts w:ascii="Times New Roman" w:hAnsi="Times New Roman" w:cs="Times New Roman"/>
-                <w:noProof/>
-                <w:webHidden/>
-              </w:rPr>
-            </w:r>
-            <w:r>
-              <w:rPr>
-                <w:rFonts w:ascii="Times New Roman" w:hAnsi="Times New Roman" w:cs="Times New Roman"/>
-                <w:noProof/>
-                <w:webHidden/>
-              </w:rPr>
-              <w:fldChar w:fldCharType="separate"/>
-            </w:r>
-            <w:r>
-              <w:rPr>
-                <w:rFonts w:ascii="Times New Roman" w:hAnsi="Times New Roman" w:cs="Times New Roman"/>
-                <w:noProof/>
-                <w:webHidden/>
-              </w:rPr>
-              <w:t>6</w:t>
-            </w:r>
-            <w:r>
-              <w:rPr>
-                <w:rFonts w:ascii="Times New Roman" w:hAnsi="Times New Roman" w:cs="Times New Roman"/>
-                <w:noProof/>
-                <w:webHidden/>
-              </w:rPr>
-              <w:fldChar w:fldCharType="end"/>
-            </w:r>
-          </w:hyperlink>
-        </w:p>
-        <w:p>
-          <w:pPr>
-            <w:pStyle w:val="TOC2"/>
-            <w:tabs>
-              <w:tab w:val="right" w:leader="dot" w:pos="8636"/>
-            </w:tabs>
-            <w:spacing w:line="360" w:lineRule="auto"/>
-            <w:rPr>
-              <w:rFonts w:ascii="Times New Roman" w:hAnsi="Times New Roman" w:cs="Times New Roman"/>
-              <w:noProof/>
-            </w:rPr>
-          </w:pPr>
-          <w:hyperlink w:anchor="_Toc243498909" w:history="1">
-            <w:r>
-              <w:rPr>
-                <w:rStyle w:val="Hyperlink"/>
-                <w:rFonts w:ascii="Times New Roman" w:hAnsi="Times New Roman" w:cs="Times New Roman"/>
-                <w:noProof/>
-              </w:rPr>
-              <w:t>AI Fluency Framework</w:t>
-            </w:r>
-            <w:r>
-              <w:rPr>
-                <w:rFonts w:ascii="Times New Roman" w:hAnsi="Times New Roman" w:cs="Times New Roman"/>
-                <w:noProof/>
-                <w:webHidden/>
-              </w:rPr>
-              <w:tab/>
-            </w:r>
-            <w:r>
-              <w:rPr>
-                <w:rFonts w:ascii="Times New Roman" w:hAnsi="Times New Roman" w:cs="Times New Roman"/>
-                <w:noProof/>
-                <w:webHidden/>
-              </w:rPr>
-              <w:fldChar w:fldCharType="begin"/>
-            </w:r>
-            <w:r>
-              <w:rPr>
-                <w:rFonts w:ascii="Times New Roman" w:hAnsi="Times New Roman" w:cs="Times New Roman"/>
-                <w:noProof/>
-                <w:webHidden/>
-              </w:rPr>
-              <w:instrText xml:space="preserve"> PAGEREF _Toc243498909 \h </w:instrText>
-            </w:r>
-            <w:r>
-              <w:rPr>
-                <w:rFonts w:ascii="Times New Roman" w:hAnsi="Times New Roman" w:cs="Times New Roman"/>
-                <w:noProof/>
-                <w:webHidden/>
-              </w:rPr>
-            </w:r>
-            <w:r>
-              <w:rPr>
-                <w:rFonts w:ascii="Times New Roman" w:hAnsi="Times New Roman" w:cs="Times New Roman"/>
-                <w:noProof/>
-                <w:webHidden/>
-              </w:rPr>
-              <w:fldChar w:fldCharType="separate"/>
-            </w:r>
-            <w:r>
-              <w:rPr>
-                <w:rFonts w:ascii="Times New Roman" w:hAnsi="Times New Roman" w:cs="Times New Roman"/>
-                <w:noProof/>
-                <w:webHidden/>
-              </w:rPr>
-              <w:t>6</w:t>
-            </w:r>
-            <w:r>
-              <w:rPr>
-                <w:rFonts w:ascii="Times New Roman" w:hAnsi="Times New Roman" w:cs="Times New Roman"/>
-                <w:noProof/>
-                <w:webHidden/>
-              </w:rPr>
-              <w:fldChar w:fldCharType="end"/>
-            </w:r>
-          </w:hyperlink>
+            <w:t>-11</w:t>
+          </w:r>
         </w:p>
         <w:p>
           <w:pPr>
@@ -3801,6 +3351,7 @@
           <w:rFonts w:ascii="Times New Roman" w:hAnsi="Times New Roman" w:cs="Times New Roman"/>
         </w:rPr>
         <w:sectPr>
+          <w:footerReference w:type="default" r:id="rId9"/>
           <w:pgSz w:w="12240" w:h="15840"/>
           <w:pgMar w:top="1440" w:right="1797" w:bottom="1440" w:left="1797" w:header="720" w:footer="720" w:gutter="0"/>
           <w:cols w:space="720"/>
@@ -3890,7 +3441,23 @@
         <w:rPr>
           <w:rFonts w:ascii="Times New Roman" w:hAnsi="Times New Roman" w:cs="Times New Roman"/>
         </w:rPr>
-        <w:t>By the end of 2025, the Irish tourism industry has employed 226,800 people and is the largest indigenous sectoral employer in regional Ireland, according to the Irish Tourism Review 2025 &amp; Outlook 2026 (Irish Tourism Industry Confederation, 2025), which also predicted a growth of 5%-7% in tourism revenue for 2026. The global tourism and hospitality industry relies heavily on human interactions as labour is undoubtedly recognized as the largest controllable expense in the hospitality industry. This project is an initiative to investigate the labour optimization in tourism as well as using predictive modelling to forecast future daily operational flow for a tourist attraction in Ireland.</w:t>
+        <w:t xml:space="preserve">By the end of 2025, the Irish tourism industry has employed 226,800 people and is the largest indigenous sectoral employer in regional Ireland, according to </w:t>
+      </w:r>
+      <w:r>
+        <w:rPr>
+          <w:rFonts w:ascii="Times New Roman" w:hAnsi="Times New Roman" w:cs="Times New Roman"/>
+          <w:b/>
+          <w:bCs/>
+          <w:i/>
+          <w:iCs/>
+        </w:rPr>
+        <w:t>the Irish Tourism Review 2025 &amp; Outlook 2026</w:t>
+      </w:r>
+      <w:r>
+        <w:rPr>
+          <w:rFonts w:ascii="Times New Roman" w:hAnsi="Times New Roman" w:cs="Times New Roman"/>
+        </w:rPr>
+        <w:t xml:space="preserve"> (Irish Tourism Industry Confederation, 2025), which also predicted a growth of 5%-7% in tourism revenue for 2026. The global tourism and hospitality industry relies heavily on human interactions as labour is undoubtedly recognized as the largest controllable expense in the hospitality industry. This project is an initiative to investigate the labour optimization in tourism as well as using predictive modelling to forecast future daily operational flow for a tourist attraction in Ireland.</w:t>
       </w:r>
     </w:p>
     <w:p>
@@ -4020,14 +3587,32 @@
     <w:p>
       <w:pPr>
         <w:rPr>
+          <w:rFonts w:ascii="Times New Roman" w:eastAsia="SimSun" w:hAnsi="Times New Roman" w:cs="Times New Roman" w:hint="eastAsia"/>
+          <w:lang w:eastAsia="zh-CN"/>
+        </w:rPr>
+      </w:pPr>
+      <w:r>
+        <w:rPr>
           <w:rFonts w:ascii="Times New Roman" w:hAnsi="Times New Roman" w:cs="Times New Roman"/>
         </w:rPr>
-      </w:pPr>
+        <w:t>Use EDA to identify key demand factors and build a predictive model to forecast daily traffic, eliminating both overstaffing and understaffing</w:t>
+      </w:r>
       <w:r>
         <w:rPr>
-          <w:rFonts w:ascii="Times New Roman" w:hAnsi="Times New Roman" w:cs="Times New Roman"/>
-        </w:rPr>
-        <w:t>Use EDA to identify key demand factors and build a predictive model to forecast daily traffic, eliminating both overstaffing and understaffing.</w:t>
+          <w:rFonts w:ascii="Times New Roman" w:eastAsia="SimSun" w:hAnsi="Times New Roman" w:cs="Times New Roman" w:hint="eastAsia"/>
+          <w:lang w:eastAsia="zh-CN"/>
+        </w:rPr>
+        <w:t>.</w:t>
+      </w:r>
+      <w:r>
+        <w:t>Implementing a predictive staffing model will accurately forecast daily visitor footfall</w:t>
+      </w:r>
+      <w:r>
+        <w:rPr>
+          <w:rFonts w:eastAsia="SimSun" w:hint="eastAsia"/>
+          <w:lang w:eastAsia="zh-CN"/>
+        </w:rPr>
+        <w:t xml:space="preserve"> using hypothesis tools.</w:t>
       </w:r>
     </w:p>
     <w:p>
@@ -4113,6 +3698,11 @@
     </w:p>
     <w:p>
       <w:pPr>
+        <w:pStyle w:val="ListParagraph"/>
+        <w:numPr>
+          <w:ilvl w:val="0"/>
+          <w:numId w:val="12"/>
+        </w:numPr>
         <w:rPr>
           <w:rFonts w:ascii="Times New Roman" w:hAnsi="Times New Roman" w:cs="Times New Roman"/>
         </w:rPr>
@@ -4126,6 +3716,11 @@
     </w:p>
     <w:p>
       <w:pPr>
+        <w:pStyle w:val="ListParagraph"/>
+        <w:numPr>
+          <w:ilvl w:val="0"/>
+          <w:numId w:val="12"/>
+        </w:numPr>
         <w:rPr>
           <w:rFonts w:ascii="Times New Roman" w:hAnsi="Times New Roman" w:cs="Times New Roman"/>
         </w:rPr>
@@ -4157,6 +3752,11 @@
     </w:p>
     <w:p>
       <w:pPr>
+        <w:pStyle w:val="ListParagraph"/>
+        <w:numPr>
+          <w:ilvl w:val="0"/>
+          <w:numId w:val="13"/>
+        </w:numPr>
         <w:rPr>
           <w:rFonts w:ascii="Times New Roman" w:hAnsi="Times New Roman" w:cs="Times New Roman"/>
         </w:rPr>
@@ -4170,6 +3770,11 @@
     </w:p>
     <w:p>
       <w:pPr>
+        <w:pStyle w:val="ListParagraph"/>
+        <w:numPr>
+          <w:ilvl w:val="0"/>
+          <w:numId w:val="13"/>
+        </w:numPr>
         <w:rPr>
           <w:rFonts w:ascii="Times New Roman" w:hAnsi="Times New Roman" w:cs="Times New Roman"/>
         </w:rPr>
@@ -4183,6 +3788,11 @@
     </w:p>
     <w:p>
       <w:pPr>
+        <w:pStyle w:val="ListParagraph"/>
+        <w:numPr>
+          <w:ilvl w:val="0"/>
+          <w:numId w:val="13"/>
+        </w:numPr>
         <w:rPr>
           <w:rFonts w:ascii="Times New Roman" w:hAnsi="Times New Roman" w:cs="Times New Roman"/>
         </w:rPr>
@@ -4196,6 +3806,11 @@
     </w:p>
     <w:p>
       <w:pPr>
+        <w:pStyle w:val="ListParagraph"/>
+        <w:numPr>
+          <w:ilvl w:val="0"/>
+          <w:numId w:val="13"/>
+        </w:numPr>
         <w:rPr>
           <w:rFonts w:ascii="Times New Roman" w:hAnsi="Times New Roman" w:cs="Times New Roman"/>
         </w:rPr>
@@ -4222,6 +3837,11 @@
     </w:p>
     <w:p>
       <w:pPr>
+        <w:pStyle w:val="ListParagraph"/>
+        <w:numPr>
+          <w:ilvl w:val="0"/>
+          <w:numId w:val="14"/>
+        </w:numPr>
         <w:rPr>
           <w:rFonts w:ascii="Times New Roman" w:hAnsi="Times New Roman" w:cs="Times New Roman"/>
         </w:rPr>
@@ -4235,6 +3855,11 @@
     </w:p>
     <w:p>
       <w:pPr>
+        <w:pStyle w:val="ListParagraph"/>
+        <w:numPr>
+          <w:ilvl w:val="0"/>
+          <w:numId w:val="14"/>
+        </w:numPr>
         <w:rPr>
           <w:rFonts w:ascii="Times New Roman" w:hAnsi="Times New Roman" w:cs="Times New Roman"/>
         </w:rPr>
@@ -4248,6 +3873,11 @@
     </w:p>
     <w:p>
       <w:pPr>
+        <w:pStyle w:val="ListParagraph"/>
+        <w:numPr>
+          <w:ilvl w:val="0"/>
+          <w:numId w:val="14"/>
+        </w:numPr>
         <w:rPr>
           <w:rFonts w:ascii="Times New Roman" w:hAnsi="Times New Roman" w:cs="Times New Roman"/>
         </w:rPr>
@@ -4328,6 +3958,11 @@
     </w:p>
     <w:p>
       <w:pPr>
+        <w:pStyle w:val="ListParagraph"/>
+        <w:numPr>
+          <w:ilvl w:val="0"/>
+          <w:numId w:val="15"/>
+        </w:numPr>
         <w:rPr>
           <w:rFonts w:ascii="Times New Roman" w:hAnsi="Times New Roman" w:cs="Times New Roman"/>
         </w:rPr>
@@ -4341,6 +3976,11 @@
     </w:p>
     <w:p>
       <w:pPr>
+        <w:pStyle w:val="ListParagraph"/>
+        <w:numPr>
+          <w:ilvl w:val="0"/>
+          <w:numId w:val="15"/>
+        </w:numPr>
         <w:rPr>
           <w:rFonts w:ascii="Times New Roman" w:hAnsi="Times New Roman" w:cs="Times New Roman"/>
         </w:rPr>
@@ -4354,6 +3994,11 @@
     </w:p>
     <w:p>
       <w:pPr>
+        <w:pStyle w:val="ListParagraph"/>
+        <w:numPr>
+          <w:ilvl w:val="0"/>
+          <w:numId w:val="15"/>
+        </w:numPr>
         <w:rPr>
           <w:rFonts w:ascii="Times New Roman" w:hAnsi="Times New Roman" w:cs="Times New Roman"/>
         </w:rPr>
@@ -4367,6 +4012,11 @@
     </w:p>
     <w:p>
       <w:pPr>
+        <w:pStyle w:val="ListParagraph"/>
+        <w:numPr>
+          <w:ilvl w:val="0"/>
+          <w:numId w:val="15"/>
+        </w:numPr>
         <w:rPr>
           <w:rFonts w:ascii="Times New Roman" w:hAnsi="Times New Roman" w:cs="Times New Roman"/>
         </w:rPr>
@@ -4392,21 +4042,79 @@
           <w:rFonts w:ascii="Times New Roman" w:hAnsi="Times New Roman" w:cs="Times New Roman"/>
           <w:color w:val="auto"/>
         </w:rPr>
+        <w:lastRenderedPageBreak/>
         <w:t>6.3 Overall Workflow</w:t>
       </w:r>
       <w:bookmarkEnd w:id="15"/>
     </w:p>
     <w:p>
       <w:pPr>
-        <w:rPr>
-          <w:rFonts w:ascii="Times New Roman" w:hAnsi="Times New Roman" w:cs="Times New Roman"/>
-        </w:rPr>
-      </w:pPr>
+        <w:pStyle w:val="Heading2"/>
+        <w:rPr>
+          <w:rFonts w:ascii="Times New Roman" w:eastAsia="SimSun" w:hAnsi="Times New Roman" w:cs="Times New Roman"/>
+          <w:color w:val="auto"/>
+          <w:lang w:eastAsia="zh-CN"/>
+        </w:rPr>
+      </w:pPr>
+      <w:bookmarkStart w:id="16" w:name="_Toc243498889"/>
       <w:r>
         <w:rPr>
-          <w:rFonts w:ascii="Times New Roman" w:hAnsi="Times New Roman" w:cs="Times New Roman"/>
-        </w:rPr>
-        <w:t>[Please insert your Workflow Diagram image here]</w:t>
+          <w:rFonts w:ascii="Times New Roman" w:eastAsiaTheme="minorEastAsia" w:hAnsi="Times New Roman" w:cs="Times New Roman"/>
+          <w:noProof/>
+          <w:color w:val="000000" w:themeColor="text1"/>
+          <w:lang w:eastAsia="zh-CN"/>
+        </w:rPr>
+        <w:drawing>
+          <wp:inline distT="0" distB="0" distL="0" distR="0" wp14:anchorId="1925C112" wp14:editId="7947EE58">
+            <wp:extent cx="5731510" cy="3229877"/>
+            <wp:effectExtent l="0" t="0" r="2540" b="8890"/>
+            <wp:docPr id="4" name="Picture 4"/>
+            <wp:cNvGraphicFramePr>
+              <a:graphicFrameLocks xmlns:a="http://schemas.openxmlformats.org/drawingml/2006/main" noChangeAspect="1"/>
+            </wp:cNvGraphicFramePr>
+            <a:graphic xmlns:a="http://schemas.openxmlformats.org/drawingml/2006/main">
+              <a:graphicData uri="http://schemas.openxmlformats.org/drawingml/2006/picture">
+                <pic:pic xmlns:pic="http://schemas.openxmlformats.org/drawingml/2006/picture">
+                  <pic:nvPicPr>
+                    <pic:cNvPr id="0" name="Picture 1"/>
+                    <pic:cNvPicPr>
+                      <a:picLocks noChangeAspect="1" noChangeArrowheads="1"/>
+                    </pic:cNvPicPr>
+                  </pic:nvPicPr>
+                  <pic:blipFill rotWithShape="1">
+                    <a:blip r:embed="rId10">
+                      <a:extLst>
+                        <a:ext uri="{28A0092B-C50C-407E-A947-70E740481C1C}">
+                          <a14:useLocalDpi xmlns:a14="http://schemas.microsoft.com/office/drawing/2010/main" val="0"/>
+                        </a:ext>
+                      </a:extLst>
+                    </a:blip>
+                    <a:srcRect l="2382" b="1052"/>
+                    <a:stretch/>
+                  </pic:blipFill>
+                  <pic:spPr bwMode="auto">
+                    <a:xfrm>
+                      <a:off x="0" y="0"/>
+                      <a:ext cx="5731510" cy="3229877"/>
+                    </a:xfrm>
+                    <a:prstGeom prst="rect">
+                      <a:avLst/>
+                    </a:prstGeom>
+                    <a:noFill/>
+                    <a:ln>
+                      <a:noFill/>
+                    </a:ln>
+                    <a:extLst>
+                      <a:ext uri="{53640926-AAD7-44D8-BBD7-CCE9431645EC}">
+                        <a14:shadowObscured xmlns:a14="http://schemas.microsoft.com/office/drawing/2010/main"/>
+                      </a:ext>
+                    </a:extLst>
+                  </pic:spPr>
+                </pic:pic>
+              </a:graphicData>
+            </a:graphic>
+          </wp:inline>
+        </w:drawing>
       </w:r>
     </w:p>
     <w:p>
@@ -4417,13 +4125,11 @@
           <w:color w:val="auto"/>
         </w:rPr>
       </w:pPr>
-      <w:bookmarkStart w:id="16" w:name="_Toc243498889"/>
       <w:r>
         <w:rPr>
           <w:rFonts w:ascii="Times New Roman" w:hAnsi="Times New Roman" w:cs="Times New Roman"/>
           <w:color w:val="auto"/>
         </w:rPr>
-        <w:lastRenderedPageBreak/>
         <w:t>7. Data Sources</w:t>
       </w:r>
       <w:bookmarkEnd w:id="16"/>
@@ -4646,6 +4352,7 @@
           <w:rFonts w:ascii="Times New Roman" w:hAnsi="Times New Roman" w:cs="Times New Roman"/>
           <w:color w:val="auto"/>
         </w:rPr>
+        <w:lastRenderedPageBreak/>
         <w:t>8.3 Interactive Dashboard</w:t>
       </w:r>
       <w:bookmarkEnd w:id="24"/>
@@ -4701,15 +4408,69 @@
     </w:p>
     <w:p>
       <w:pPr>
-        <w:rPr>
-          <w:rFonts w:ascii="Times New Roman" w:hAnsi="Times New Roman" w:cs="Times New Roman"/>
-        </w:rPr>
-      </w:pPr>
+        <w:pStyle w:val="Heading3"/>
+        <w:rPr>
+          <w:rFonts w:ascii="Times New Roman" w:eastAsia="SimSun" w:hAnsi="Times New Roman" w:cs="Times New Roman"/>
+          <w:color w:val="auto"/>
+          <w:lang w:eastAsia="zh-CN"/>
+        </w:rPr>
+      </w:pPr>
+      <w:bookmarkStart w:id="27" w:name="_Toc243498900"/>
       <w:r>
         <w:rPr>
-          <w:rFonts w:ascii="Times New Roman" w:hAnsi="Times New Roman" w:cs="Times New Roman"/>
-        </w:rPr>
-        <w:t>[Please insert your Timeline Diagram image here]</w:t>
+          <w:rFonts w:ascii="Times New Roman" w:eastAsiaTheme="minorEastAsia" w:hAnsi="Times New Roman" w:cs="Times New Roman"/>
+          <w:noProof/>
+          <w:color w:val="000000" w:themeColor="text1"/>
+          <w:lang w:eastAsia="zh-CN"/>
+        </w:rPr>
+        <w:drawing>
+          <wp:inline distT="0" distB="0" distL="0" distR="0" wp14:anchorId="69028C85" wp14:editId="2EB3876A">
+            <wp:extent cx="5731510" cy="2335461"/>
+            <wp:effectExtent l="0" t="0" r="2540" b="8255"/>
+            <wp:docPr id="8" name="Picture 8"/>
+            <wp:cNvGraphicFramePr>
+              <a:graphicFrameLocks xmlns:a="http://schemas.openxmlformats.org/drawingml/2006/main" noChangeAspect="1"/>
+            </wp:cNvGraphicFramePr>
+            <a:graphic xmlns:a="http://schemas.openxmlformats.org/drawingml/2006/main">
+              <a:graphicData uri="http://schemas.openxmlformats.org/drawingml/2006/picture">
+                <pic:pic xmlns:pic="http://schemas.openxmlformats.org/drawingml/2006/picture">
+                  <pic:nvPicPr>
+                    <pic:cNvPr id="0" name="Picture 8"/>
+                    <pic:cNvPicPr>
+                      <a:picLocks noChangeAspect="1" noChangeArrowheads="1"/>
+                    </pic:cNvPicPr>
+                  </pic:nvPicPr>
+                  <pic:blipFill>
+                    <a:blip r:embed="rId11">
+                      <a:extLst>
+                        <a:ext uri="{28A0092B-C50C-407E-A947-70E740481C1C}">
+                          <a14:useLocalDpi xmlns:a14="http://schemas.microsoft.com/office/drawing/2010/main" val="0"/>
+                        </a:ext>
+                      </a:extLst>
+                    </a:blip>
+                    <a:srcRect/>
+                    <a:stretch>
+                      <a:fillRect/>
+                    </a:stretch>
+                  </pic:blipFill>
+                  <pic:spPr bwMode="auto">
+                    <a:xfrm>
+                      <a:off x="0" y="0"/>
+                      <a:ext cx="5731510" cy="2335461"/>
+                    </a:xfrm>
+                    <a:prstGeom prst="rect">
+                      <a:avLst/>
+                    </a:prstGeom>
+                    <a:noFill/>
+                    <a:ln>
+                      <a:noFill/>
+                    </a:ln>
+                  </pic:spPr>
+                </pic:pic>
+              </a:graphicData>
+            </a:graphic>
+          </wp:inline>
+        </w:drawing>
       </w:r>
     </w:p>
     <w:p>
@@ -4720,7 +4481,6 @@
           <w:color w:val="auto"/>
         </w:rPr>
       </w:pPr>
-      <w:bookmarkStart w:id="27" w:name="_Toc243498900"/>
       <w:r>
         <w:rPr>
           <w:rFonts w:ascii="Times New Roman" w:hAnsi="Times New Roman" w:cs="Times New Roman"/>
@@ -4732,15 +4492,69 @@
     </w:p>
     <w:p>
       <w:pPr>
-        <w:rPr>
-          <w:rFonts w:ascii="Times New Roman" w:hAnsi="Times New Roman" w:cs="Times New Roman"/>
-        </w:rPr>
-      </w:pPr>
+        <w:pStyle w:val="Heading2"/>
+        <w:rPr>
+          <w:rFonts w:ascii="Times New Roman" w:eastAsia="SimSun" w:hAnsi="Times New Roman" w:cs="Times New Roman"/>
+          <w:color w:val="auto"/>
+          <w:lang w:eastAsia="zh-CN"/>
+        </w:rPr>
+      </w:pPr>
+      <w:bookmarkStart w:id="28" w:name="_Toc243498901"/>
       <w:r>
         <w:rPr>
-          <w:rFonts w:ascii="Times New Roman" w:hAnsi="Times New Roman" w:cs="Times New Roman"/>
-        </w:rPr>
-        <w:t>[Please insert your Gantt Chart image here]</w:t>
+          <w:rFonts w:ascii="Times New Roman" w:eastAsiaTheme="minorEastAsia" w:hAnsi="Times New Roman" w:cs="Times New Roman"/>
+          <w:noProof/>
+          <w:color w:val="000000" w:themeColor="text1"/>
+          <w:lang w:eastAsia="zh-CN"/>
+        </w:rPr>
+        <w:drawing>
+          <wp:inline distT="0" distB="0" distL="0" distR="0" wp14:anchorId="5FDB8E0A" wp14:editId="6829D536">
+            <wp:extent cx="5731510" cy="2250440"/>
+            <wp:effectExtent l="0" t="0" r="2540" b="0"/>
+            <wp:docPr id="9" name="Picture 9"/>
+            <wp:cNvGraphicFramePr>
+              <a:graphicFrameLocks xmlns:a="http://schemas.openxmlformats.org/drawingml/2006/main" noChangeAspect="1"/>
+            </wp:cNvGraphicFramePr>
+            <a:graphic xmlns:a="http://schemas.openxmlformats.org/drawingml/2006/main">
+              <a:graphicData uri="http://schemas.openxmlformats.org/drawingml/2006/picture">
+                <pic:pic xmlns:pic="http://schemas.openxmlformats.org/drawingml/2006/picture">
+                  <pic:nvPicPr>
+                    <pic:cNvPr id="0" name="Picture 9"/>
+                    <pic:cNvPicPr>
+                      <a:picLocks noChangeAspect="1" noChangeArrowheads="1"/>
+                    </pic:cNvPicPr>
+                  </pic:nvPicPr>
+                  <pic:blipFill>
+                    <a:blip r:embed="rId12" cstate="print">
+                      <a:extLst>
+                        <a:ext uri="{28A0092B-C50C-407E-A947-70E740481C1C}">
+                          <a14:useLocalDpi xmlns:a14="http://schemas.microsoft.com/office/drawing/2010/main" val="0"/>
+                        </a:ext>
+                      </a:extLst>
+                    </a:blip>
+                    <a:srcRect/>
+                    <a:stretch>
+                      <a:fillRect/>
+                    </a:stretch>
+                  </pic:blipFill>
+                  <pic:spPr bwMode="auto">
+                    <a:xfrm>
+                      <a:off x="0" y="0"/>
+                      <a:ext cx="5731510" cy="2250440"/>
+                    </a:xfrm>
+                    <a:prstGeom prst="rect">
+                      <a:avLst/>
+                    </a:prstGeom>
+                    <a:noFill/>
+                    <a:ln>
+                      <a:noFill/>
+                    </a:ln>
+                  </pic:spPr>
+                </pic:pic>
+              </a:graphicData>
+            </a:graphic>
+          </wp:inline>
+        </w:drawing>
       </w:r>
     </w:p>
     <w:p>
@@ -4751,7 +4565,6 @@
           <w:color w:val="auto"/>
         </w:rPr>
       </w:pPr>
-      <w:bookmarkStart w:id="28" w:name="_Toc243498901"/>
       <w:r>
         <w:rPr>
           <w:rFonts w:ascii="Times New Roman" w:hAnsi="Times New Roman" w:cs="Times New Roman"/>
@@ -4819,7 +4632,6 @@
           <w:rFonts w:ascii="Times New Roman" w:hAnsi="Times New Roman" w:cs="Times New Roman"/>
           <w:color w:val="auto"/>
         </w:rPr>
-        <w:lastRenderedPageBreak/>
         <w:t>10.2 Permissions</w:t>
       </w:r>
       <w:bookmarkEnd w:id="30"/>
@@ -4851,6 +4663,7 @@
           <w:rFonts w:ascii="Times New Roman" w:hAnsi="Times New Roman" w:cs="Times New Roman"/>
           <w:color w:val="auto"/>
         </w:rPr>
+        <w:lastRenderedPageBreak/>
         <w:t>10.3 Security</w:t>
       </w:r>
       <w:bookmarkEnd w:id="31"/>
@@ -4908,7 +4721,7 @@
     <w:p>
       <w:pPr>
         <w:rPr>
-          <w:rFonts w:eastAsia="SimSun" w:hint="eastAsia"/>
+          <w:rFonts w:eastAsia="SimSun"/>
           <w:lang w:eastAsia="zh-CN"/>
         </w:rPr>
       </w:pPr>
@@ -4936,7 +4749,20 @@
         <w:rPr>
           <w:rFonts w:ascii="Times New Roman" w:hAnsi="Times New Roman" w:cs="Times New Roman"/>
         </w:rPr>
-        <w:t>. Available at: https://www.itic.ie/ye25-outlook26/ (Accessed: 21 October 2026).</w:t>
+        <w:t xml:space="preserve">. Available at: </w:t>
+      </w:r>
+      <w:r>
+        <w:rPr>
+          <w:rFonts w:ascii="Times New Roman" w:hAnsi="Times New Roman" w:cs="Times New Roman"/>
+          <w:u w:val="single"/>
+        </w:rPr>
+        <w:t>https://www.itic.ie/ye25-outlook26/</w:t>
+      </w:r>
+      <w:r>
+        <w:rPr>
+          <w:rFonts w:ascii="Times New Roman" w:hAnsi="Times New Roman" w:cs="Times New Roman"/>
+        </w:rPr>
+        <w:t xml:space="preserve"> (Accessed: 21 October 2026).</w:t>
       </w:r>
     </w:p>
     <w:p>
@@ -4979,7 +4805,7 @@
     <w:p>
       <w:pPr>
         <w:rPr>
-          <w:rFonts w:eastAsia="SimSun" w:hint="eastAsia"/>
+          <w:rFonts w:eastAsia="SimSun"/>
           <w:lang w:eastAsia="zh-CN"/>
         </w:rPr>
       </w:pPr>
@@ -5033,25 +4859,7 @@
           <w:sz w:val="28"/>
           <w:szCs w:val="28"/>
         </w:rPr>
-        <w:t xml:space="preserve"> </w:t>
-      </w:r>
-      <w:proofErr w:type="gramStart"/>
-      <w:r>
-        <w:rPr>
-          <w:rFonts w:ascii="Times New Roman" w:hAnsi="Times New Roman" w:cs="Times New Roman"/>
-          <w:sz w:val="28"/>
-          <w:szCs w:val="28"/>
-        </w:rPr>
-        <w:t>scaling ,</w:t>
-      </w:r>
-      <w:proofErr w:type="gramEnd"/>
-      <w:r>
-        <w:rPr>
-          <w:rFonts w:ascii="Times New Roman" w:hAnsi="Times New Roman" w:cs="Times New Roman"/>
-          <w:sz w:val="28"/>
-          <w:szCs w:val="28"/>
-        </w:rPr>
-        <w:t xml:space="preserve"> </w:t>
+        <w:t xml:space="preserve"> scaling, </w:t>
       </w:r>
       <w:r>
         <w:rPr>
@@ -5319,8 +5127,10 @@
           <w:rFonts w:ascii="Times New Roman" w:hAnsi="Times New Roman" w:cs="Times New Roman"/>
         </w:rPr>
         <w:sectPr>
+          <w:footerReference w:type="default" r:id="rId13"/>
           <w:pgSz w:w="11906" w:h="16838"/>
           <w:pgMar w:top="1440" w:right="1440" w:bottom="1440" w:left="1440" w:header="708" w:footer="708" w:gutter="0"/>
+          <w:pgNumType w:start="1"/>
           <w:cols w:space="720"/>
         </w:sectPr>
       </w:pPr>
@@ -5667,27 +5477,7 @@
                 <w:szCs w:val="20"/>
                 <w:lang w:eastAsia="zh-CN"/>
               </w:rPr>
-              <w:t xml:space="preserve">1. In the part of </w:t>
-            </w:r>
-            <w:proofErr w:type="gramStart"/>
-            <w:r>
-              <w:rPr>
-                <w:rFonts w:ascii="Times New Roman" w:hAnsi="Times New Roman" w:cs="Times New Roman"/>
-                <w:sz w:val="20"/>
-                <w:szCs w:val="20"/>
-                <w:lang w:eastAsia="zh-CN"/>
-              </w:rPr>
-              <w:t>7.Data</w:t>
-            </w:r>
-            <w:proofErr w:type="gramEnd"/>
-            <w:r>
-              <w:rPr>
-                <w:rFonts w:ascii="Times New Roman" w:hAnsi="Times New Roman" w:cs="Times New Roman"/>
-                <w:sz w:val="20"/>
-                <w:szCs w:val="20"/>
-                <w:lang w:eastAsia="zh-CN"/>
-              </w:rPr>
-              <w:t xml:space="preserve"> Source, In order to transform a real-time operational dataset into something I can work on for this project, I used AI to generate an authentic dataset (1000 rows,11 columns) based on the original dataset(84 rows,11 columns) using data masking and scaling.</w:t>
+              <w:t>1. In the part of 7.Data Source, In order to transform a real-time operational dataset into something I can work on for this project, I used AI to generate an authentic dataset (1000 rows,11 columns) based on the original dataset(84 rows,11 columns) using data masking and scaling.</w:t>
             </w:r>
           </w:p>
           <w:p>
@@ -5716,47 +5506,7 @@
                 <w:szCs w:val="20"/>
                 <w:lang w:eastAsia="zh-CN"/>
               </w:rPr>
-              <w:t xml:space="preserve">2. In the part of </w:t>
-            </w:r>
-            <w:proofErr w:type="gramStart"/>
-            <w:r>
-              <w:rPr>
-                <w:rFonts w:ascii="Times New Roman" w:hAnsi="Times New Roman" w:cs="Times New Roman"/>
-                <w:sz w:val="20"/>
-                <w:szCs w:val="20"/>
-                <w:lang w:eastAsia="zh-CN"/>
-              </w:rPr>
-              <w:t>7.Data</w:t>
-            </w:r>
-            <w:proofErr w:type="gramEnd"/>
-            <w:r>
-              <w:rPr>
-                <w:rFonts w:ascii="Times New Roman" w:hAnsi="Times New Roman" w:cs="Times New Roman"/>
-                <w:sz w:val="20"/>
-                <w:szCs w:val="20"/>
-                <w:lang w:eastAsia="zh-CN"/>
-              </w:rPr>
-              <w:t xml:space="preserve"> Source, I use AI for solving a visualization issue with plotting the Poisson distribution for VIP tickets, as the 501 overlapping labels, turning your x-axis into a solid black </w:t>
-            </w:r>
-            <w:proofErr w:type="spellStart"/>
-            <w:r>
-              <w:rPr>
-                <w:rFonts w:ascii="Times New Roman" w:hAnsi="Times New Roman" w:cs="Times New Roman"/>
-                <w:sz w:val="20"/>
-                <w:szCs w:val="20"/>
-                <w:lang w:eastAsia="zh-CN"/>
-              </w:rPr>
-              <w:t>bar,I</w:t>
-            </w:r>
-            <w:proofErr w:type="spellEnd"/>
-            <w:r>
-              <w:rPr>
-                <w:rFonts w:ascii="Times New Roman" w:hAnsi="Times New Roman" w:cs="Times New Roman"/>
-                <w:sz w:val="20"/>
-                <w:szCs w:val="20"/>
-                <w:lang w:eastAsia="zh-CN"/>
-              </w:rPr>
-              <w:t xml:space="preserve"> need to get a better and clearer visualization.</w:t>
+              <w:t>2. In the part of 7.Data Source, I use AI for solving a visualization issue with plotting the Poisson distribution for VIP tickets, as the 501 overlapping labels, turning your x-axis into a solid black bar,I need to get a better and clearer visualization.</w:t>
             </w:r>
           </w:p>
         </w:tc>
@@ -5966,34 +5716,15 @@
                 <w:szCs w:val="20"/>
                 <w:lang w:eastAsia="zh-CN"/>
               </w:rPr>
-              <w:t xml:space="preserve"> </w:t>
-            </w:r>
-            <w:proofErr w:type="gramStart"/>
+              <w:t xml:space="preserve"> 1 </w:t>
+            </w:r>
             <w:r>
               <w:rPr>
                 <w:rFonts w:ascii="Times New Roman" w:hAnsi="Times New Roman" w:cs="Times New Roman"/>
                 <w:sz w:val="20"/>
                 <w:szCs w:val="20"/>
-                <w:lang w:eastAsia="zh-CN"/>
-              </w:rPr>
-              <w:t xml:space="preserve">1 </w:t>
-            </w:r>
-            <w:r>
-              <w:rPr>
-                <w:rFonts w:ascii="Times New Roman" w:hAnsi="Times New Roman" w:cs="Times New Roman"/>
-                <w:sz w:val="20"/>
-                <w:szCs w:val="20"/>
-              </w:rPr>
-              <w:t>:</w:t>
-            </w:r>
-            <w:proofErr w:type="gramEnd"/>
-            <w:r>
-              <w:rPr>
-                <w:rFonts w:ascii="Times New Roman" w:hAnsi="Times New Roman" w:cs="Times New Roman"/>
-                <w:sz w:val="20"/>
-                <w:szCs w:val="20"/>
-              </w:rPr>
-              <w:t xml:space="preserve"> </w:t>
+              </w:rPr>
+              <w:t xml:space="preserve">: </w:t>
             </w:r>
           </w:p>
           <w:p>
@@ -6030,25 +5761,7 @@
                 <w:sz w:val="20"/>
                 <w:szCs w:val="20"/>
               </w:rPr>
-              <w:t xml:space="preserve">I recorded operational data of a company for the daily tourists and staff numbers , some numbers were random or wrong as well , </w:t>
-            </w:r>
-            <w:proofErr w:type="spellStart"/>
-            <w:r>
-              <w:rPr>
-                <w:rFonts w:ascii="Times New Roman" w:hAnsi="Times New Roman" w:cs="Times New Roman"/>
-                <w:sz w:val="20"/>
-                <w:szCs w:val="20"/>
-              </w:rPr>
-              <w:t>i</w:t>
-            </w:r>
-            <w:proofErr w:type="spellEnd"/>
-            <w:r>
-              <w:rPr>
-                <w:rFonts w:ascii="Times New Roman" w:hAnsi="Times New Roman" w:cs="Times New Roman"/>
-                <w:sz w:val="20"/>
-                <w:szCs w:val="20"/>
-              </w:rPr>
-              <w:t xml:space="preserve"> want to use it to do my CA project for data ana</w:t>
+              <w:t>I recorded operational data of a company for the daily tourists and staff numbers , some numbers were random or wrong as well , i want to use it to do my CA project for data ana</w:t>
             </w:r>
             <w:r>
               <w:rPr>
@@ -6065,43 +5778,7 @@
                 <w:sz w:val="20"/>
                 <w:szCs w:val="20"/>
               </w:rPr>
-              <w:t xml:space="preserve">sis, </w:t>
-            </w:r>
-            <w:proofErr w:type="spellStart"/>
-            <w:r>
-              <w:rPr>
-                <w:rFonts w:ascii="Times New Roman" w:hAnsi="Times New Roman" w:cs="Times New Roman"/>
-                <w:sz w:val="20"/>
-                <w:szCs w:val="20"/>
-              </w:rPr>
-              <w:t>i</w:t>
-            </w:r>
-            <w:proofErr w:type="spellEnd"/>
-            <w:r>
-              <w:rPr>
-                <w:rFonts w:ascii="Times New Roman" w:hAnsi="Times New Roman" w:cs="Times New Roman"/>
-                <w:sz w:val="20"/>
-                <w:szCs w:val="20"/>
-              </w:rPr>
-              <w:t xml:space="preserve"> changed or deleted some columns and rename them by masking the data, can you generate a 100% legal raw dataset based on the dataset </w:t>
-            </w:r>
-            <w:proofErr w:type="spellStart"/>
-            <w:r>
-              <w:rPr>
-                <w:rFonts w:ascii="Times New Roman" w:hAnsi="Times New Roman" w:cs="Times New Roman"/>
-                <w:sz w:val="20"/>
-                <w:szCs w:val="20"/>
-              </w:rPr>
-              <w:t>i</w:t>
-            </w:r>
-            <w:proofErr w:type="spellEnd"/>
-            <w:r>
-              <w:rPr>
-                <w:rFonts w:ascii="Times New Roman" w:hAnsi="Times New Roman" w:cs="Times New Roman"/>
-                <w:sz w:val="20"/>
-                <w:szCs w:val="20"/>
-              </w:rPr>
-              <w:t xml:space="preserve"> already updated? do not clean the data, leave the raw data as it is . and tell me where you change the data exactly</w:t>
+              <w:t>sis, i changed or deleted some columns and rename them by masking the data, can you generate a 100% legal raw dataset based on the dataset i already updated? do not clean the data, leave the raw data as it is . and tell me where you change the data exactly</w:t>
             </w:r>
             <w:r>
               <w:rPr>
@@ -6110,21 +5787,17 @@
                 <w:szCs w:val="20"/>
                 <w:lang w:eastAsia="zh-CN"/>
               </w:rPr>
-              <w:t>” (</w:t>
-            </w:r>
-            <w:proofErr w:type="spellStart"/>
-            <w:proofErr w:type="gramStart"/>
-            <w:r>
-              <w:rPr>
-                <w:rFonts w:ascii="Times New Roman" w:hAnsi="Times New Roman" w:cs="Times New Roman"/>
+              <w:t>” (output:</w:t>
+            </w:r>
+            <w:r>
+              <w:rPr>
+                <w:rFonts w:ascii="Times New Roman" w:eastAsia="SimSun" w:hAnsi="Times New Roman" w:cs="Times New Roman" w:hint="eastAsia"/>
                 <w:sz w:val="20"/>
                 <w:szCs w:val="20"/>
                 <w:lang w:eastAsia="zh-CN"/>
               </w:rPr>
-              <w:t>output:dataset</w:t>
-            </w:r>
-            <w:proofErr w:type="spellEnd"/>
-            <w:proofErr w:type="gramEnd"/>
+              <w:t xml:space="preserve"> </w:t>
+            </w:r>
             <w:r>
               <w:rPr>
                 <w:rFonts w:ascii="Times New Roman" w:hAnsi="Times New Roman" w:cs="Times New Roman"/>
@@ -6132,7 +5805,7 @@
                 <w:szCs w:val="20"/>
                 <w:lang w:eastAsia="zh-CN"/>
               </w:rPr>
-              <w:t>)</w:t>
+              <w:t>dataset)</w:t>
             </w:r>
           </w:p>
           <w:p>
@@ -6196,23 +5869,13 @@
                 <w:szCs w:val="20"/>
               </w:rPr>
             </w:pPr>
-            <w:proofErr w:type="spellStart"/>
             <w:r>
               <w:rPr>
                 <w:rFonts w:ascii="Times New Roman" w:hAnsi="Times New Roman" w:cs="Times New Roman"/>
                 <w:sz w:val="20"/>
                 <w:szCs w:val="20"/>
               </w:rPr>
-              <w:t>lambda_vip</w:t>
-            </w:r>
-            <w:proofErr w:type="spellEnd"/>
-            <w:r>
-              <w:rPr>
-                <w:rFonts w:ascii="Times New Roman" w:hAnsi="Times New Roman" w:cs="Times New Roman"/>
-                <w:sz w:val="20"/>
-                <w:szCs w:val="20"/>
-              </w:rPr>
-              <w:t xml:space="preserve"> = 484 </w:t>
+              <w:t>lambda_vip = 484 </w:t>
             </w:r>
           </w:p>
           <w:p>
@@ -6229,27 +5892,7 @@
                 <w:sz w:val="20"/>
                 <w:szCs w:val="20"/>
               </w:rPr>
-              <w:t xml:space="preserve">k = </w:t>
-            </w:r>
-            <w:proofErr w:type="spellStart"/>
-            <w:proofErr w:type="gramStart"/>
-            <w:r>
-              <w:rPr>
-                <w:rFonts w:ascii="Times New Roman" w:hAnsi="Times New Roman" w:cs="Times New Roman"/>
-                <w:sz w:val="20"/>
-                <w:szCs w:val="20"/>
-              </w:rPr>
-              <w:t>np.arange</w:t>
-            </w:r>
-            <w:proofErr w:type="spellEnd"/>
-            <w:proofErr w:type="gramEnd"/>
-            <w:r>
-              <w:rPr>
-                <w:rFonts w:ascii="Times New Roman" w:hAnsi="Times New Roman" w:cs="Times New Roman"/>
-                <w:sz w:val="20"/>
-                <w:szCs w:val="20"/>
-              </w:rPr>
-              <w:t>(0, 501)  # number of having 500 VIP visitors (0 to 500)</w:t>
+              <w:t>k = np.arange(0, 501)  # number of having 500 VIP visitors (0 to 500)</w:t>
             </w:r>
           </w:p>
           <w:p>
@@ -6266,25 +5909,7 @@
                 <w:sz w:val="20"/>
                 <w:szCs w:val="20"/>
               </w:rPr>
-              <w:t># Poisson probability mass function (</w:t>
-            </w:r>
-            <w:proofErr w:type="spellStart"/>
-            <w:r>
-              <w:rPr>
-                <w:rFonts w:ascii="Times New Roman" w:hAnsi="Times New Roman" w:cs="Times New Roman"/>
-                <w:sz w:val="20"/>
-                <w:szCs w:val="20"/>
-              </w:rPr>
-              <w:t>pmf</w:t>
-            </w:r>
-            <w:proofErr w:type="spellEnd"/>
-            <w:r>
-              <w:rPr>
-                <w:rFonts w:ascii="Times New Roman" w:hAnsi="Times New Roman" w:cs="Times New Roman"/>
-                <w:sz w:val="20"/>
-                <w:szCs w:val="20"/>
-              </w:rPr>
-              <w:t>)</w:t>
+              <w:t># Poisson probability mass function (pmf)</w:t>
             </w:r>
           </w:p>
           <w:p>
@@ -6296,69 +5921,13 @@
                 <w:lang w:eastAsia="zh-CN"/>
               </w:rPr>
             </w:pPr>
-            <w:proofErr w:type="spellStart"/>
             <w:r>
               <w:rPr>
                 <w:rFonts w:ascii="Times New Roman" w:hAnsi="Times New Roman" w:cs="Times New Roman"/>
                 <w:sz w:val="20"/>
                 <w:szCs w:val="20"/>
               </w:rPr>
-              <w:t>poisson_pmf</w:t>
-            </w:r>
-            <w:proofErr w:type="spellEnd"/>
-            <w:r>
-              <w:rPr>
-                <w:rFonts w:ascii="Times New Roman" w:hAnsi="Times New Roman" w:cs="Times New Roman"/>
-                <w:sz w:val="20"/>
-                <w:szCs w:val="20"/>
-              </w:rPr>
-              <w:t xml:space="preserve"> = </w:t>
-            </w:r>
-            <w:proofErr w:type="spellStart"/>
-            <w:proofErr w:type="gramStart"/>
-            <w:r>
-              <w:rPr>
-                <w:rFonts w:ascii="Times New Roman" w:hAnsi="Times New Roman" w:cs="Times New Roman"/>
-                <w:sz w:val="20"/>
-                <w:szCs w:val="20"/>
-              </w:rPr>
-              <w:t>poisson.pmf</w:t>
-            </w:r>
-            <w:proofErr w:type="spellEnd"/>
-            <w:r>
-              <w:rPr>
-                <w:rFonts w:ascii="Times New Roman" w:hAnsi="Times New Roman" w:cs="Times New Roman"/>
-                <w:sz w:val="20"/>
-                <w:szCs w:val="20"/>
-              </w:rPr>
-              <w:t>(</w:t>
-            </w:r>
-            <w:proofErr w:type="gramEnd"/>
-            <w:r>
-              <w:rPr>
-                <w:rFonts w:ascii="Times New Roman" w:hAnsi="Times New Roman" w:cs="Times New Roman"/>
-                <w:sz w:val="20"/>
-                <w:szCs w:val="20"/>
-              </w:rPr>
-              <w:t xml:space="preserve">k, </w:t>
-            </w:r>
-            <w:proofErr w:type="spellStart"/>
-            <w:r>
-              <w:rPr>
-                <w:rFonts w:ascii="Times New Roman" w:hAnsi="Times New Roman" w:cs="Times New Roman"/>
-                <w:sz w:val="20"/>
-                <w:szCs w:val="20"/>
-              </w:rPr>
-              <w:t>lambda_vip</w:t>
-            </w:r>
-            <w:proofErr w:type="spellEnd"/>
-            <w:r>
-              <w:rPr>
-                <w:rFonts w:ascii="Times New Roman" w:hAnsi="Times New Roman" w:cs="Times New Roman"/>
-                <w:sz w:val="20"/>
-                <w:szCs w:val="20"/>
-              </w:rPr>
-              <w:t>)</w:t>
+              <w:t>poisson_pmf = poisson.pmf(k, lambda_vip)</w:t>
             </w:r>
             <w:r>
               <w:rPr>
@@ -6386,35 +5955,16 @@
                 <w:szCs w:val="20"/>
                 <w:lang w:eastAsia="zh-CN"/>
               </w:rPr>
-              <w:t xml:space="preserve">(output: correct python </w:t>
-            </w:r>
-            <w:proofErr w:type="gramStart"/>
-            <w:r>
-              <w:rPr>
-                <w:rFonts w:ascii="Times New Roman" w:hAnsi="Times New Roman" w:cs="Times New Roman"/>
+              <w:t>(output: correct python code )</w:t>
+            </w:r>
+          </w:p>
+          <w:p>
+            <w:pPr>
+              <w:rPr>
+                <w:rFonts w:ascii="Times New Roman" w:eastAsia="SimSun" w:hAnsi="Times New Roman" w:cs="Times New Roman"/>
                 <w:sz w:val="20"/>
                 <w:szCs w:val="20"/>
                 <w:lang w:eastAsia="zh-CN"/>
-              </w:rPr>
-              <w:t>code )</w:t>
-            </w:r>
-            <w:proofErr w:type="gramEnd"/>
-          </w:p>
-          <w:p>
-            <w:pPr>
-              <w:rPr>
-                <w:rFonts w:ascii="Times New Roman" w:hAnsi="Times New Roman" w:cs="Times New Roman"/>
-                <w:sz w:val="20"/>
-                <w:szCs w:val="20"/>
-              </w:rPr>
-            </w:pPr>
-          </w:p>
-          <w:p>
-            <w:pPr>
-              <w:rPr>
-                <w:rFonts w:ascii="Times New Roman" w:hAnsi="Times New Roman" w:cs="Times New Roman"/>
-                <w:sz w:val="20"/>
-                <w:szCs w:val="20"/>
               </w:rPr>
             </w:pPr>
           </w:p>
@@ -6481,8 +6031,6 @@
             <w:pPr>
               <w:rPr>
                 <w:rFonts w:ascii="Times New Roman" w:hAnsi="Times New Roman" w:cs="Times New Roman"/>
-                <w:i/>
-                <w:iCs/>
                 <w:sz w:val="20"/>
                 <w:szCs w:val="20"/>
               </w:rPr>
@@ -6490,8 +6038,6 @@
             <w:r>
               <w:rPr>
                 <w:rFonts w:ascii="Times New Roman" w:hAnsi="Times New Roman" w:cs="Times New Roman"/>
-                <w:i/>
-                <w:iCs/>
                 <w:sz w:val="20"/>
                 <w:szCs w:val="20"/>
               </w:rPr>
@@ -6507,8 +6053,6 @@
             <w:pPr>
               <w:rPr>
                 <w:rFonts w:ascii="Times New Roman" w:hAnsi="Times New Roman" w:cs="Times New Roman"/>
-                <w:i/>
-                <w:iCs/>
                 <w:sz w:val="20"/>
                 <w:szCs w:val="20"/>
               </w:rPr>
@@ -6519,7 +6063,7 @@
                 <w:sz w:val="20"/>
                 <w:szCs w:val="20"/>
               </w:rPr>
-              <w:t xml:space="preserve">In your reflection, critically evaluate the AI output: what did you accept, modify, or reject — and why? Assess accuracy, relevance, and quality. You are responsible for </w:t>
+              <w:t>In your reflection, critically evaluate the AI output: what did you accept, modify, or reject — and why? Assess accuracy, relevance, and quality. You are responsible for verifying all AI-</w:t>
             </w:r>
             <w:r>
               <w:rPr>
@@ -6528,7 +6072,7 @@
                 <w:szCs w:val="20"/>
               </w:rPr>
               <w:lastRenderedPageBreak/>
-              <w:t>verifying all AI-generated content before submitting.</w:t>
+              <w:t>generated content before submitting.</w:t>
             </w:r>
           </w:p>
         </w:tc>
@@ -6589,8 +6133,6 @@
             <w:pPr>
               <w:rPr>
                 <w:rFonts w:ascii="Times New Roman" w:hAnsi="Times New Roman" w:cs="Times New Roman"/>
-                <w:i/>
-                <w:iCs/>
                 <w:sz w:val="20"/>
                 <w:szCs w:val="20"/>
               </w:rPr>
@@ -6617,8 +6159,6 @@
             <w:pPr>
               <w:rPr>
                 <w:rFonts w:ascii="Times New Roman" w:hAnsi="Times New Roman" w:cs="Times New Roman"/>
-                <w:i/>
-                <w:iCs/>
                 <w:sz w:val="20"/>
                 <w:szCs w:val="20"/>
                 <w:lang w:eastAsia="zh-CN"/>
@@ -6627,107 +6167,81 @@
             <w:r>
               <w:rPr>
                 <w:rFonts w:ascii="Times New Roman" w:hAnsi="Times New Roman" w:cs="Times New Roman"/>
-                <w:i/>
-                <w:iCs/>
                 <w:sz w:val="20"/>
                 <w:szCs w:val="20"/>
                 <w:lang w:eastAsia="zh-CN"/>
               </w:rPr>
-              <w:t xml:space="preserve">1.I accept the AI output as it utilizes for this analysis and turns the original </w:t>
-            </w:r>
-            <w:proofErr w:type="gramStart"/>
-            <w:r>
-              <w:rPr>
-                <w:rFonts w:ascii="Times New Roman" w:hAnsi="Times New Roman" w:cs="Times New Roman"/>
-                <w:i/>
-                <w:iCs/>
+              <w:t xml:space="preserve">1.I accept the AI output as it utilizes for this analysis and turns the original dataset into simulated and anonymized operational time-series records representing visitor numbers and staffing allocations across operational departments, which is workable for my project. But as in real practice, </w:t>
+            </w:r>
+            <w:r>
+              <w:rPr>
+                <w:rFonts w:ascii="Times New Roman" w:hAnsi="Times New Roman" w:cs="Times New Roman"/>
                 <w:sz w:val="20"/>
                 <w:szCs w:val="20"/>
                 <w:lang w:eastAsia="zh-CN"/>
               </w:rPr>
-              <w:t>dataset  into</w:t>
-            </w:r>
-            <w:proofErr w:type="gramEnd"/>
-            <w:r>
-              <w:rPr>
-                <w:rFonts w:ascii="Times New Roman" w:hAnsi="Times New Roman" w:cs="Times New Roman"/>
-                <w:i/>
-                <w:iCs/>
+              <w:lastRenderedPageBreak/>
+              <w:t>there are traffic peak on public and bank holidays like St</w:t>
+            </w:r>
+            <w:r>
+              <w:rPr>
+                <w:rFonts w:ascii="Times New Roman" w:eastAsia="SimSun" w:hAnsi="Times New Roman" w:cs="Times New Roman" w:hint="eastAsia"/>
                 <w:sz w:val="20"/>
                 <w:szCs w:val="20"/>
                 <w:lang w:eastAsia="zh-CN"/>
               </w:rPr>
-              <w:t xml:space="preserve"> simulated and anonymized operational time-series records representing visitor numbers and staffing allocations across operational </w:t>
-            </w:r>
-            <w:r>
-              <w:rPr>
-                <w:rFonts w:ascii="Times New Roman" w:hAnsi="Times New Roman" w:cs="Times New Roman"/>
-                <w:i/>
-                <w:iCs/>
+              <w:t xml:space="preserve"> </w:t>
+            </w:r>
+            <w:r>
+              <w:rPr>
+                <w:rFonts w:ascii="Times New Roman" w:hAnsi="Times New Roman" w:cs="Times New Roman"/>
                 <w:sz w:val="20"/>
                 <w:szCs w:val="20"/>
                 <w:lang w:eastAsia="zh-CN"/>
               </w:rPr>
-              <w:lastRenderedPageBreak/>
-              <w:t xml:space="preserve">departments, which is workable for my project. But as in real practice, there are traffic peak on public and bank holidays like </w:t>
-            </w:r>
-            <w:proofErr w:type="spellStart"/>
-            <w:proofErr w:type="gramStart"/>
-            <w:r>
-              <w:rPr>
-                <w:rFonts w:ascii="Times New Roman" w:hAnsi="Times New Roman" w:cs="Times New Roman"/>
-                <w:i/>
-                <w:iCs/>
+              <w:t>Patrick Day,</w:t>
+            </w:r>
+            <w:r>
+              <w:rPr>
+                <w:rFonts w:ascii="Times New Roman" w:eastAsia="SimSun" w:hAnsi="Times New Roman" w:cs="Times New Roman" w:hint="eastAsia"/>
                 <w:sz w:val="20"/>
                 <w:szCs w:val="20"/>
                 <w:lang w:eastAsia="zh-CN"/>
               </w:rPr>
-              <w:t>St.Patrick</w:t>
-            </w:r>
-            <w:proofErr w:type="spellEnd"/>
-            <w:proofErr w:type="gramEnd"/>
-            <w:r>
-              <w:rPr>
-                <w:rFonts w:ascii="Times New Roman" w:hAnsi="Times New Roman" w:cs="Times New Roman"/>
-                <w:i/>
-                <w:iCs/>
+              <w:t xml:space="preserve"> </w:t>
+            </w:r>
+            <w:r>
+              <w:rPr>
+                <w:rFonts w:ascii="Times New Roman" w:hAnsi="Times New Roman" w:cs="Times New Roman"/>
                 <w:sz w:val="20"/>
                 <w:szCs w:val="20"/>
                 <w:lang w:eastAsia="zh-CN"/>
               </w:rPr>
-              <w:t xml:space="preserve"> Day ,</w:t>
-            </w:r>
-            <w:proofErr w:type="spellStart"/>
-            <w:r>
-              <w:rPr>
-                <w:rFonts w:ascii="Times New Roman" w:hAnsi="Times New Roman" w:cs="Times New Roman"/>
-                <w:i/>
-                <w:iCs/>
+              <w:t>Xmas,</w:t>
+            </w:r>
+            <w:r>
+              <w:rPr>
+                <w:rFonts w:ascii="Times New Roman" w:eastAsia="SimSun" w:hAnsi="Times New Roman" w:cs="Times New Roman" w:hint="eastAsia"/>
                 <w:sz w:val="20"/>
                 <w:szCs w:val="20"/>
                 <w:lang w:eastAsia="zh-CN"/>
               </w:rPr>
-              <w:t>Xmas,and</w:t>
-            </w:r>
-            <w:proofErr w:type="spellEnd"/>
-            <w:r>
-              <w:rPr>
-                <w:rFonts w:ascii="Times New Roman" w:hAnsi="Times New Roman" w:cs="Times New Roman"/>
-                <w:i/>
-                <w:iCs/>
+              <w:t xml:space="preserve"> </w:t>
+            </w:r>
+            <w:r>
+              <w:rPr>
+                <w:rFonts w:ascii="Times New Roman" w:hAnsi="Times New Roman" w:cs="Times New Roman"/>
                 <w:sz w:val="20"/>
                 <w:szCs w:val="20"/>
                 <w:lang w:eastAsia="zh-CN"/>
               </w:rPr>
-              <w:t xml:space="preserve"> New Year’s day, I adjusted the numbers for those public holidays in order to get a more accurate analysis.</w:t>
+              <w:t>and New Year’s day, I adjusted the numbers for those public holidays in order to get a more accurate analysis.</w:t>
             </w:r>
           </w:p>
           <w:p>
             <w:pPr>
               <w:rPr>
                 <w:rFonts w:ascii="Times New Roman" w:hAnsi="Times New Roman" w:cs="Times New Roman"/>
-                <w:i/>
-                <w:iCs/>
                 <w:sz w:val="20"/>
                 <w:szCs w:val="20"/>
                 <w:lang w:eastAsia="zh-CN"/>
@@ -6736,8 +6250,6 @@
             <w:r>
               <w:rPr>
                 <w:rFonts w:ascii="Times New Roman" w:hAnsi="Times New Roman" w:cs="Times New Roman"/>
-                <w:i/>
-                <w:iCs/>
                 <w:sz w:val="20"/>
                 <w:szCs w:val="20"/>
                 <w:lang w:eastAsia="zh-CN"/>
@@ -6749,8 +6261,6 @@
             <w:pPr>
               <w:rPr>
                 <w:rFonts w:ascii="Times New Roman" w:hAnsi="Times New Roman" w:cs="Times New Roman"/>
-                <w:i/>
-                <w:iCs/>
                 <w:sz w:val="20"/>
                 <w:szCs w:val="20"/>
               </w:rPr>
@@ -6831,8 +6341,6 @@
             <w:r>
               <w:rPr>
                 <w:rFonts w:ascii="Times New Roman" w:hAnsi="Times New Roman" w:cs="Times New Roman"/>
-                <w:i/>
-                <w:iCs/>
                 <w:sz w:val="20"/>
                 <w:szCs w:val="20"/>
               </w:rPr>
@@ -6848,8 +6356,6 @@
             <w:pPr>
               <w:rPr>
                 <w:rFonts w:ascii="Times New Roman" w:hAnsi="Times New Roman" w:cs="Times New Roman"/>
-                <w:i/>
-                <w:iCs/>
                 <w:sz w:val="20"/>
                 <w:szCs w:val="20"/>
               </w:rPr>
@@ -6860,25 +6366,7 @@
                 <w:sz w:val="20"/>
                 <w:szCs w:val="20"/>
               </w:rPr>
-              <w:t xml:space="preserve">Declare all AI tools used and cite them here. Briefly outline how you considered data protection, copyright, and ethical responsibilities when choosing what to input into any AI system. </w:t>
-            </w:r>
-            <w:proofErr w:type="spellStart"/>
-            <w:r>
-              <w:rPr>
-                <w:rFonts w:ascii="Times New Roman" w:hAnsi="Times New Roman" w:cs="Times New Roman"/>
-                <w:sz w:val="20"/>
-                <w:szCs w:val="20"/>
-              </w:rPr>
-              <w:t>Unauthorised</w:t>
-            </w:r>
-            <w:proofErr w:type="spellEnd"/>
-            <w:r>
-              <w:rPr>
-                <w:rFonts w:ascii="Times New Roman" w:hAnsi="Times New Roman" w:cs="Times New Roman"/>
-                <w:sz w:val="20"/>
-                <w:szCs w:val="20"/>
-              </w:rPr>
-              <w:t xml:space="preserve"> use is subject to CCT disciplinary procedures.</w:t>
+              <w:t>Declare all AI tools used and cite them here. Briefly outline how you considered data protection, copyright, and ethical responsibilities when choosing what to input into any AI system. Unauthorised use is subject to CCT disciplinary procedures.</w:t>
             </w:r>
           </w:p>
         </w:tc>
@@ -6996,33 +6484,159 @@
     <w:p>
       <w:pPr>
         <w:rPr>
-          <w:rFonts w:ascii="Times New Roman" w:hAnsi="Times New Roman" w:cs="Times New Roman"/>
-          <w:color w:val="FF0000"/>
+          <w:rFonts w:ascii="Times New Roman" w:eastAsia="SimSun" w:hAnsi="Times New Roman" w:cs="Times New Roman"/>
           <w:lang w:eastAsia="zh-CN"/>
         </w:rPr>
       </w:pPr>
-      <w:r>
-        <w:rPr>
-          <w:rFonts w:ascii="Times New Roman" w:hAnsi="Times New Roman" w:cs="Times New Roman"/>
-          <w:color w:val="FF0000"/>
-          <w:lang w:eastAsia="zh-CN"/>
-        </w:rPr>
-        <w:t xml:space="preserve">Prompt </w:t>
-      </w:r>
-      <w:proofErr w:type="gramStart"/>
-      <w:r>
-        <w:rPr>
-          <w:rFonts w:ascii="Times New Roman" w:hAnsi="Times New Roman" w:cs="Times New Roman"/>
-          <w:color w:val="FF0000"/>
-          <w:lang w:eastAsia="zh-CN"/>
-        </w:rPr>
-        <w:t>1 :</w:t>
-      </w:r>
-      <w:proofErr w:type="gramEnd"/>
     </w:p>
     <w:p>
       <w:pPr>
         <w:rPr>
+          <w:rFonts w:ascii="Times New Roman" w:eastAsia="SimSun" w:hAnsi="Times New Roman" w:cs="Times New Roman"/>
+          <w:lang w:eastAsia="zh-CN"/>
+        </w:rPr>
+      </w:pPr>
+    </w:p>
+    <w:p>
+      <w:pPr>
+        <w:rPr>
+          <w:rFonts w:ascii="Times New Roman" w:eastAsia="SimSun" w:hAnsi="Times New Roman" w:cs="Times New Roman"/>
+          <w:lang w:eastAsia="zh-CN"/>
+        </w:rPr>
+      </w:pPr>
+    </w:p>
+    <w:p>
+      <w:pPr>
+        <w:rPr>
+          <w:rFonts w:ascii="Times New Roman" w:eastAsia="SimSun" w:hAnsi="Times New Roman" w:cs="Times New Roman"/>
+          <w:lang w:eastAsia="zh-CN"/>
+        </w:rPr>
+      </w:pPr>
+    </w:p>
+    <w:p>
+      <w:pPr>
+        <w:rPr>
+          <w:rFonts w:ascii="Times New Roman" w:eastAsia="SimSun" w:hAnsi="Times New Roman" w:cs="Times New Roman"/>
+          <w:lang w:eastAsia="zh-CN"/>
+        </w:rPr>
+      </w:pPr>
+    </w:p>
+    <w:p>
+      <w:pPr>
+        <w:rPr>
+          <w:rFonts w:ascii="Times New Roman" w:eastAsia="SimSun" w:hAnsi="Times New Roman" w:cs="Times New Roman"/>
+          <w:lang w:eastAsia="zh-CN"/>
+        </w:rPr>
+      </w:pPr>
+    </w:p>
+    <w:p>
+      <w:pPr>
+        <w:rPr>
+          <w:rFonts w:ascii="Times New Roman" w:eastAsia="SimSun" w:hAnsi="Times New Roman" w:cs="Times New Roman"/>
+          <w:lang w:eastAsia="zh-CN"/>
+        </w:rPr>
+      </w:pPr>
+    </w:p>
+    <w:p>
+      <w:pPr>
+        <w:rPr>
+          <w:rFonts w:ascii="Times New Roman" w:eastAsia="SimSun" w:hAnsi="Times New Roman" w:cs="Times New Roman"/>
+          <w:lang w:eastAsia="zh-CN"/>
+        </w:rPr>
+      </w:pPr>
+    </w:p>
+    <w:p>
+      <w:pPr>
+        <w:rPr>
+          <w:rFonts w:ascii="Times New Roman" w:eastAsia="SimSun" w:hAnsi="Times New Roman" w:cs="Times New Roman"/>
+          <w:lang w:eastAsia="zh-CN"/>
+        </w:rPr>
+      </w:pPr>
+    </w:p>
+    <w:p>
+      <w:pPr>
+        <w:rPr>
+          <w:rFonts w:ascii="Times New Roman" w:eastAsia="SimSun" w:hAnsi="Times New Roman" w:cs="Times New Roman"/>
+          <w:lang w:eastAsia="zh-CN"/>
+        </w:rPr>
+      </w:pPr>
+    </w:p>
+    <w:p>
+      <w:pPr>
+        <w:rPr>
+          <w:rFonts w:ascii="Times New Roman" w:eastAsia="SimSun" w:hAnsi="Times New Roman" w:cs="Times New Roman"/>
+          <w:lang w:eastAsia="zh-CN"/>
+        </w:rPr>
+      </w:pPr>
+    </w:p>
+    <w:p>
+      <w:pPr>
+        <w:rPr>
+          <w:rFonts w:ascii="Times New Roman" w:eastAsia="SimSun" w:hAnsi="Times New Roman" w:cs="Times New Roman"/>
+          <w:lang w:eastAsia="zh-CN"/>
+        </w:rPr>
+      </w:pPr>
+    </w:p>
+    <w:p>
+      <w:pPr>
+        <w:rPr>
+          <w:rFonts w:ascii="Times New Roman" w:eastAsia="SimSun" w:hAnsi="Times New Roman" w:cs="Times New Roman"/>
+          <w:lang w:eastAsia="zh-CN"/>
+        </w:rPr>
+      </w:pPr>
+    </w:p>
+    <w:p>
+      <w:pPr>
+        <w:rPr>
+          <w:rFonts w:ascii="Times New Roman" w:eastAsia="SimSun" w:hAnsi="Times New Roman" w:cs="Times New Roman"/>
+          <w:lang w:eastAsia="zh-CN"/>
+        </w:rPr>
+      </w:pPr>
+    </w:p>
+    <w:p>
+      <w:pPr>
+        <w:rPr>
+          <w:rFonts w:ascii="Times New Roman" w:eastAsia="SimSun" w:hAnsi="Times New Roman" w:cs="Times New Roman"/>
+          <w:lang w:eastAsia="zh-CN"/>
+        </w:rPr>
+      </w:pPr>
+    </w:p>
+    <w:p>
+      <w:pPr>
+        <w:jc w:val="center"/>
+        <w:rPr>
+          <w:rFonts w:ascii="Times New Roman" w:eastAsia="SimSun" w:hAnsi="Times New Roman" w:cs="Times New Roman"/>
+          <w:lang w:eastAsia="zh-CN"/>
+        </w:rPr>
+      </w:pPr>
+    </w:p>
+    <w:p>
+      <w:pPr>
+        <w:jc w:val="center"/>
+        <w:rPr>
+          <w:rFonts w:ascii="Times New Roman" w:eastAsia="SimSun" w:hAnsi="Times New Roman" w:cs="Times New Roman"/>
+          <w:lang w:eastAsia="zh-CN"/>
+        </w:rPr>
+      </w:pPr>
+      <w:r>
+        <w:rPr>
+          <w:rFonts w:ascii="Times New Roman" w:hAnsi="Times New Roman" w:cs="Times New Roman"/>
+          <w:lang w:eastAsia="zh-CN"/>
+        </w:rPr>
+        <w:t>Prompt 1 :</w:t>
+      </w:r>
+      <w:r>
+        <w:rPr>
+          <w:rFonts w:ascii="Times New Roman" w:eastAsia="SimSun" w:hAnsi="Times New Roman" w:cs="Times New Roman" w:hint="eastAsia"/>
+          <w:lang w:eastAsia="zh-CN"/>
+        </w:rPr>
+        <w:t xml:space="preserve"> screenshot</w:t>
+      </w:r>
+    </w:p>
+    <w:p>
+      <w:pPr>
+        <w:jc w:val="center"/>
+        <w:rPr>
           <w:rFonts w:ascii="Times New Roman" w:hAnsi="Times New Roman" w:cs="Times New Roman"/>
           <w:noProof/>
         </w:rPr>
@@ -7032,7 +6646,6 @@
           <w:rFonts w:ascii="Times New Roman" w:hAnsi="Times New Roman" w:cs="Times New Roman"/>
           <w:noProof/>
         </w:rPr>
-        <w:lastRenderedPageBreak/>
         <w:drawing>
           <wp:inline distT="0" distB="0" distL="0" distR="0" wp14:anchorId="29670B41" wp14:editId="71277E8C">
             <wp:extent cx="5731510" cy="5560060"/>
@@ -7051,7 +6664,7 @@
                     </pic:cNvPicPr>
                   </pic:nvPicPr>
                   <pic:blipFill>
-                    <a:blip r:embed="rId9">
+                    <a:blip r:embed="rId14">
                       <a:extLst>
                         <a:ext uri="{28A0092B-C50C-407E-A947-70E740481C1C}">
                           <a14:useLocalDpi xmlns:a14="http://schemas.microsoft.com/office/drawing/2010/main" val="0"/>
@@ -7082,18 +6695,14 @@
           </wp:inline>
         </w:drawing>
       </w:r>
-      <w:r>
-        <w:rPr>
-          <w:rFonts w:ascii="Times New Roman" w:hAnsi="Times New Roman" w:cs="Times New Roman"/>
-          <w:noProof/>
-        </w:rPr>
-        <w:t xml:space="preserve"> </w:t>
-      </w:r>
     </w:p>
     <w:p>
       <w:pPr>
-        <w:rPr>
-          <w:rFonts w:ascii="Times New Roman" w:hAnsi="Times New Roman" w:cs="Times New Roman"/>
+        <w:jc w:val="center"/>
+        <w:rPr>
+          <w:rFonts w:ascii="Times New Roman" w:eastAsia="SimSun" w:hAnsi="Times New Roman" w:cs="Times New Roman"/>
+          <w:noProof/>
+          <w:lang w:eastAsia="zh-CN"/>
         </w:rPr>
       </w:pPr>
       <w:r>
@@ -7107,13 +6716,21 @@
       </w:r>
       <w:r>
         <w:rPr>
+          <w:rFonts w:ascii="Times New Roman" w:eastAsia="SimSun" w:hAnsi="Times New Roman" w:cs="Times New Roman" w:hint="eastAsia"/>
+          <w:noProof/>
+          <w:lang w:eastAsia="zh-CN"/>
+        </w:rPr>
+        <w:t>screenshot</w:t>
+      </w:r>
+      <w:r>
+        <w:rPr>
           <w:rFonts w:ascii="Times New Roman" w:hAnsi="Times New Roman" w:cs="Times New Roman"/>
           <w:noProof/>
         </w:rPr>
         <w:drawing>
-          <wp:inline distT="0" distB="0" distL="0" distR="0" wp14:anchorId="132EBB12" wp14:editId="02CB5EE9">
-            <wp:extent cx="5731510" cy="3909695"/>
-            <wp:effectExtent l="0" t="0" r="2540" b="0"/>
+          <wp:inline distT="0" distB="0" distL="0" distR="0" wp14:anchorId="132EBB12" wp14:editId="5771B4F3">
+            <wp:extent cx="4968543" cy="3389244"/>
+            <wp:effectExtent l="0" t="0" r="3810" b="1905"/>
             <wp:docPr id="3" name="Picture 3"/>
             <wp:cNvGraphicFramePr>
               <a:graphicFrameLocks xmlns:a="http://schemas.openxmlformats.org/drawingml/2006/main" noChangeAspect="1"/>
@@ -7126,7 +6743,7 @@
                     <pic:cNvPicPr/>
                   </pic:nvPicPr>
                   <pic:blipFill>
-                    <a:blip r:embed="rId10"/>
+                    <a:blip r:embed="rId15"/>
                     <a:stretch>
                       <a:fillRect/>
                     </a:stretch>
@@ -7134,7 +6751,55 @@
                   <pic:spPr>
                     <a:xfrm>
                       <a:off x="0" y="0"/>
-                      <a:ext cx="5731510" cy="3909695"/>
+                      <a:ext cx="4974268" cy="3393149"/>
+                    </a:xfrm>
+                    <a:prstGeom prst="rect">
+                      <a:avLst/>
+                    </a:prstGeom>
+                  </pic:spPr>
+                </pic:pic>
+              </a:graphicData>
+            </a:graphic>
+          </wp:inline>
+        </w:drawing>
+      </w:r>
+    </w:p>
+    <w:p>
+      <w:pPr>
+        <w:jc w:val="center"/>
+        <w:rPr>
+          <w:rFonts w:ascii="Times New Roman" w:hAnsi="Times New Roman" w:cs="Times New Roman"/>
+        </w:rPr>
+      </w:pPr>
+      <w:r>
+        <w:rPr>
+          <w:noProof/>
+        </w:rPr>
+        <w:drawing>
+          <wp:inline distT="0" distB="0" distL="0" distR="0" wp14:anchorId="6024D859" wp14:editId="137A07A6">
+            <wp:extent cx="4979504" cy="3676419"/>
+            <wp:effectExtent l="0" t="0" r="0" b="635"/>
+            <wp:docPr id="5" name="Picture 5"/>
+            <wp:cNvGraphicFramePr>
+              <a:graphicFrameLocks xmlns:a="http://schemas.openxmlformats.org/drawingml/2006/main" noChangeAspect="1"/>
+            </wp:cNvGraphicFramePr>
+            <a:graphic xmlns:a="http://schemas.openxmlformats.org/drawingml/2006/main">
+              <a:graphicData uri="http://schemas.openxmlformats.org/drawingml/2006/picture">
+                <pic:pic xmlns:pic="http://schemas.openxmlformats.org/drawingml/2006/picture">
+                  <pic:nvPicPr>
+                    <pic:cNvPr id="1" name=""/>
+                    <pic:cNvPicPr/>
+                  </pic:nvPicPr>
+                  <pic:blipFill>
+                    <a:blip r:embed="rId16"/>
+                    <a:stretch>
+                      <a:fillRect/>
+                    </a:stretch>
+                  </pic:blipFill>
+                  <pic:spPr>
+                    <a:xfrm>
+                      <a:off x="0" y="0"/>
+                      <a:ext cx="4983263" cy="3679194"/>
                     </a:xfrm>
                     <a:prstGeom prst="rect">
                       <a:avLst/>
@@ -7148,10 +6813,9 @@
       </w:r>
     </w:p>
     <w:sectPr>
-      <w:footerReference w:type="default" r:id="rId11"/>
+      <w:footerReference w:type="default" r:id="rId17"/>
       <w:pgSz w:w="12240" w:h="15840"/>
       <w:pgMar w:top="1440" w:right="1800" w:bottom="1440" w:left="1800" w:header="720" w:footer="720" w:gutter="0"/>
-      <w:pgNumType w:start="1"/>
       <w:cols w:space="720"/>
       <w:docGrid w:linePitch="360"/>
     </w:sectPr>
@@ -7186,9 +6850,25 @@
 
 <file path=word/footer1.xml><?xml version="1.0" encoding="utf-8"?>
 <w:ftr xmlns:wpc="http://schemas.microsoft.com/office/word/2010/wordprocessingCanvas" xmlns:cx="http://schemas.microsoft.com/office/drawing/2014/chartex" xmlns:cx1="http://schemas.microsoft.com/office/drawing/2015/9/8/chartex" xmlns:cx2="http://schemas.microsoft.com/office/drawing/2015/10/21/chartex" xmlns:cx3="http://schemas.microsoft.com/office/drawing/2016/5/9/chartex" xmlns:cx4="http://schemas.microsoft.com/office/drawing/2016/5/10/chartex" xmlns:cx5="http://schemas.microsoft.com/office/drawing/2016/5/11/chartex" xmlns:cx6="http://schemas.microsoft.com/office/drawing/2016/5/12/chartex" xmlns:cx7="http://schemas.microsoft.com/office/drawing/2016/5/13/chartex" xmlns:cx8="http://schemas.microsoft.com/office/drawing/2016/5/14/chartex" xmlns:mc="http://schemas.openxmlformats.org/markup-compatibility/2006" xmlns:aink="http://schemas.microsoft.com/office/drawing/2016/ink" xmlns:am3d="http://schemas.microsoft.com/office/drawing/2017/model3d" xmlns:o="urn:schemas-microsoft-com:office:office" xmlns:oel="http://schemas.microsoft.com/office/2019/extlst" xmlns:r="http://schemas.openxmlformats.org/officeDocument/2006/relationships" xmlns:m="http://schemas.openxmlformats.org/officeDocument/2006/math" xmlns:v="urn:schemas-microsoft-com:vml" xmlns:wp14="http://schemas.microsoft.com/office/word/2010/wordprocessingDrawing" xmlns:wp="http://schemas.openxmlformats.org/drawingml/2006/wordprocessingDrawing" xmlns:w10="urn:schemas-microsoft-com:office:word" xmlns:w="http://schemas.openxmlformats.org/wordprocessingml/2006/main" xmlns:w14="http://schemas.microsoft.com/office/word/2010/wordml" xmlns:w15="http://schemas.microsoft.com/office/word/2012/wordml" xmlns:w16cex="http://schemas.microsoft.com/office/word/2018/wordml/cex" xmlns:w16cid="http://schemas.microsoft.com/office/word/2016/wordml/cid" xmlns:w16="http://schemas.microsoft.com/office/word/2018/wordml" xmlns:w16sdtdh="http://schemas.microsoft.com/office/word/2020/wordml/sdtdatahash" xmlns:w16se="http://schemas.microsoft.com/office/word/2015/wordml/symex" xmlns:wpg="http://schemas.microsoft.com/office/word/2010/wordprocessingGroup" xmlns:wpi="http://schemas.microsoft.com/office/word/2010/wordprocessingInk" xmlns:wne="http://schemas.microsoft.com/office/word/2006/wordml" xmlns:wps="http://schemas.microsoft.com/office/word/2010/wordprocessingShape" mc:Ignorable="w14 w15 w16se w16cid w16 w16cex w16sdtdh wp14">
+  <w:p>
+    <w:pPr>
+      <w:pStyle w:val="Footer"/>
+      <w:jc w:val="center"/>
+    </w:pPr>
+  </w:p>
+  <w:p>
+    <w:pPr>
+      <w:pStyle w:val="Footer"/>
+    </w:pPr>
+  </w:p>
+</w:ftr>
+</file>
+
+<file path=word/footer2.xml><?xml version="1.0" encoding="utf-8"?>
+<w:ftr xmlns:wpc="http://schemas.microsoft.com/office/word/2010/wordprocessingCanvas" xmlns:cx="http://schemas.microsoft.com/office/drawing/2014/chartex" xmlns:cx1="http://schemas.microsoft.com/office/drawing/2015/9/8/chartex" xmlns:cx2="http://schemas.microsoft.com/office/drawing/2015/10/21/chartex" xmlns:cx3="http://schemas.microsoft.com/office/drawing/2016/5/9/chartex" xmlns:cx4="http://schemas.microsoft.com/office/drawing/2016/5/10/chartex" xmlns:cx5="http://schemas.microsoft.com/office/drawing/2016/5/11/chartex" xmlns:cx6="http://schemas.microsoft.com/office/drawing/2016/5/12/chartex" xmlns:cx7="http://schemas.microsoft.com/office/drawing/2016/5/13/chartex" xmlns:cx8="http://schemas.microsoft.com/office/drawing/2016/5/14/chartex" xmlns:mc="http://schemas.openxmlformats.org/markup-compatibility/2006" xmlns:aink="http://schemas.microsoft.com/office/drawing/2016/ink" xmlns:am3d="http://schemas.microsoft.com/office/drawing/2017/model3d" xmlns:o="urn:schemas-microsoft-com:office:office" xmlns:oel="http://schemas.microsoft.com/office/2019/extlst" xmlns:r="http://schemas.openxmlformats.org/officeDocument/2006/relationships" xmlns:m="http://schemas.openxmlformats.org/officeDocument/2006/math" xmlns:v="urn:schemas-microsoft-com:vml" xmlns:wp14="http://schemas.microsoft.com/office/word/2010/wordprocessingDrawing" xmlns:wp="http://schemas.openxmlformats.org/drawingml/2006/wordprocessingDrawing" xmlns:w10="urn:schemas-microsoft-com:office:word" xmlns:w="http://schemas.openxmlformats.org/wordprocessingml/2006/main" xmlns:w14="http://schemas.microsoft.com/office/word/2010/wordml" xmlns:w15="http://schemas.microsoft.com/office/word/2012/wordml" xmlns:w16cex="http://schemas.microsoft.com/office/word/2018/wordml/cex" xmlns:w16cid="http://schemas.microsoft.com/office/word/2016/wordml/cid" xmlns:w16="http://schemas.microsoft.com/office/word/2018/wordml" xmlns:w16sdtdh="http://schemas.microsoft.com/office/word/2020/wordml/sdtdatahash" xmlns:w16se="http://schemas.microsoft.com/office/word/2015/wordml/symex" xmlns:wpg="http://schemas.microsoft.com/office/word/2010/wordprocessingGroup" xmlns:wpi="http://schemas.microsoft.com/office/word/2010/wordprocessingInk" xmlns:wne="http://schemas.microsoft.com/office/word/2006/wordml" xmlns:wps="http://schemas.microsoft.com/office/word/2010/wordprocessingShape" mc:Ignorable="w14 w15 w16se w16cid w16 w16cex w16sdtdh wp14">
   <w:sdt>
     <w:sdtPr>
-      <w:id w:val="-678350208"/>
+      <w:id w:val="1305970880"/>
       <w:docPartObj>
         <w:docPartGallery w:val="Page Numbers (Bottom of Page)"/>
         <w:docPartUnique/>
@@ -7232,7 +6912,63 @@
   <w:p>
     <w:pPr>
       <w:pStyle w:val="Footer"/>
-      <w:jc w:val="center"/>
+    </w:pPr>
+  </w:p>
+</w:ftr>
+</file>
+
+<file path=word/footer3.xml><?xml version="1.0" encoding="utf-8"?>
+<w:ftr xmlns:wpc="http://schemas.microsoft.com/office/word/2010/wordprocessingCanvas" xmlns:cx="http://schemas.microsoft.com/office/drawing/2014/chartex" xmlns:cx1="http://schemas.microsoft.com/office/drawing/2015/9/8/chartex" xmlns:cx2="http://schemas.microsoft.com/office/drawing/2015/10/21/chartex" xmlns:cx3="http://schemas.microsoft.com/office/drawing/2016/5/9/chartex" xmlns:cx4="http://schemas.microsoft.com/office/drawing/2016/5/10/chartex" xmlns:cx5="http://schemas.microsoft.com/office/drawing/2016/5/11/chartex" xmlns:cx6="http://schemas.microsoft.com/office/drawing/2016/5/12/chartex" xmlns:cx7="http://schemas.microsoft.com/office/drawing/2016/5/13/chartex" xmlns:cx8="http://schemas.microsoft.com/office/drawing/2016/5/14/chartex" xmlns:mc="http://schemas.openxmlformats.org/markup-compatibility/2006" xmlns:aink="http://schemas.microsoft.com/office/drawing/2016/ink" xmlns:am3d="http://schemas.microsoft.com/office/drawing/2017/model3d" xmlns:o="urn:schemas-microsoft-com:office:office" xmlns:oel="http://schemas.microsoft.com/office/2019/extlst" xmlns:r="http://schemas.openxmlformats.org/officeDocument/2006/relationships" xmlns:m="http://schemas.openxmlformats.org/officeDocument/2006/math" xmlns:v="urn:schemas-microsoft-com:vml" xmlns:wp14="http://schemas.microsoft.com/office/word/2010/wordprocessingDrawing" xmlns:wp="http://schemas.openxmlformats.org/drawingml/2006/wordprocessingDrawing" xmlns:w10="urn:schemas-microsoft-com:office:word" xmlns:w="http://schemas.openxmlformats.org/wordprocessingml/2006/main" xmlns:w14="http://schemas.microsoft.com/office/word/2010/wordml" xmlns:w15="http://schemas.microsoft.com/office/word/2012/wordml" xmlns:w16cex="http://schemas.microsoft.com/office/word/2018/wordml/cex" xmlns:w16cid="http://schemas.microsoft.com/office/word/2016/wordml/cid" xmlns:w16="http://schemas.microsoft.com/office/word/2018/wordml" xmlns:w16sdtdh="http://schemas.microsoft.com/office/word/2020/wordml/sdtdatahash" xmlns:w16se="http://schemas.microsoft.com/office/word/2015/wordml/symex" xmlns:wpg="http://schemas.microsoft.com/office/word/2010/wordprocessingGroup" xmlns:wpi="http://schemas.microsoft.com/office/word/2010/wordprocessingInk" xmlns:wne="http://schemas.microsoft.com/office/word/2006/wordml" xmlns:wps="http://schemas.microsoft.com/office/word/2010/wordprocessingShape" mc:Ignorable="w14 w15 w16se w16cid w16 w16cex w16sdtdh wp14">
+  <w:sdt>
+    <w:sdtPr>
+      <w:id w:val="594672287"/>
+      <w:docPartObj>
+        <w:docPartGallery w:val="Page Numbers (Bottom of Page)"/>
+        <w:docPartUnique/>
+      </w:docPartObj>
+    </w:sdtPr>
+    <w:sdtEndPr>
+      <w:rPr>
+        <w:noProof/>
+      </w:rPr>
+    </w:sdtEndPr>
+    <w:sdtContent>
+      <w:p>
+        <w:pPr>
+          <w:pStyle w:val="Footer"/>
+          <w:jc w:val="center"/>
+        </w:pPr>
+        <w:r>
+          <w:fldChar w:fldCharType="begin"/>
+        </w:r>
+        <w:r>
+          <w:instrText xml:space="preserve"> PAGE   \* MERGEFORMAT </w:instrText>
+        </w:r>
+        <w:r>
+          <w:fldChar w:fldCharType="separate"/>
+        </w:r>
+        <w:r>
+          <w:rPr>
+            <w:noProof/>
+          </w:rPr>
+          <w:t>2</w:t>
+        </w:r>
+        <w:r>
+          <w:rPr>
+            <w:noProof/>
+          </w:rPr>
+          <w:fldChar w:fldCharType="end"/>
+        </w:r>
+      </w:p>
+    </w:sdtContent>
+  </w:sdt>
+  <w:p>
+    <w:pPr>
+      <w:pStyle w:val="Footer"/>
+      <w:rPr>
+        <w:rFonts w:eastAsia="SimSun"/>
+        <w:lang w:eastAsia="zh-CN"/>
+      </w:rPr>
     </w:pPr>
   </w:p>
 </w:ftr>
@@ -7437,6 +7173,178 @@
     </w:lvl>
   </w:abstractNum>
   <w:abstractNum w:abstractNumId="9" w15:restartNumberingAfterBreak="0">
+    <w:nsid w:val="02063D86"/>
+    <w:multiLevelType w:val="hybridMultilevel"/>
+    <w:tmpl w:val="FE303BA8"/>
+    <w:lvl w:ilvl="0" w:tplc="08090011">
+      <w:start w:val="1"/>
+      <w:numFmt w:val="decimal"/>
+      <w:lvlText w:val="%1)"/>
+      <w:lvlJc w:val="left"/>
+      <w:pPr>
+        <w:ind w:left="720" w:hanging="360"/>
+      </w:pPr>
+    </w:lvl>
+    <w:lvl w:ilvl="1" w:tplc="08090019" w:tentative="1">
+      <w:start w:val="1"/>
+      <w:numFmt w:val="lowerLetter"/>
+      <w:lvlText w:val="%2."/>
+      <w:lvlJc w:val="left"/>
+      <w:pPr>
+        <w:ind w:left="1440" w:hanging="360"/>
+      </w:pPr>
+    </w:lvl>
+    <w:lvl w:ilvl="2" w:tplc="0809001B" w:tentative="1">
+      <w:start w:val="1"/>
+      <w:numFmt w:val="lowerRoman"/>
+      <w:lvlText w:val="%3."/>
+      <w:lvlJc w:val="right"/>
+      <w:pPr>
+        <w:ind w:left="2160" w:hanging="180"/>
+      </w:pPr>
+    </w:lvl>
+    <w:lvl w:ilvl="3" w:tplc="0809000F" w:tentative="1">
+      <w:start w:val="1"/>
+      <w:numFmt w:val="decimal"/>
+      <w:lvlText w:val="%4."/>
+      <w:lvlJc w:val="left"/>
+      <w:pPr>
+        <w:ind w:left="2880" w:hanging="360"/>
+      </w:pPr>
+    </w:lvl>
+    <w:lvl w:ilvl="4" w:tplc="08090019" w:tentative="1">
+      <w:start w:val="1"/>
+      <w:numFmt w:val="lowerLetter"/>
+      <w:lvlText w:val="%5."/>
+      <w:lvlJc w:val="left"/>
+      <w:pPr>
+        <w:ind w:left="3600" w:hanging="360"/>
+      </w:pPr>
+    </w:lvl>
+    <w:lvl w:ilvl="5" w:tplc="0809001B" w:tentative="1">
+      <w:start w:val="1"/>
+      <w:numFmt w:val="lowerRoman"/>
+      <w:lvlText w:val="%6."/>
+      <w:lvlJc w:val="right"/>
+      <w:pPr>
+        <w:ind w:left="4320" w:hanging="180"/>
+      </w:pPr>
+    </w:lvl>
+    <w:lvl w:ilvl="6" w:tplc="0809000F" w:tentative="1">
+      <w:start w:val="1"/>
+      <w:numFmt w:val="decimal"/>
+      <w:lvlText w:val="%7."/>
+      <w:lvlJc w:val="left"/>
+      <w:pPr>
+        <w:ind w:left="5040" w:hanging="360"/>
+      </w:pPr>
+    </w:lvl>
+    <w:lvl w:ilvl="7" w:tplc="08090019" w:tentative="1">
+      <w:start w:val="1"/>
+      <w:numFmt w:val="lowerLetter"/>
+      <w:lvlText w:val="%8."/>
+      <w:lvlJc w:val="left"/>
+      <w:pPr>
+        <w:ind w:left="5760" w:hanging="360"/>
+      </w:pPr>
+    </w:lvl>
+    <w:lvl w:ilvl="8" w:tplc="0809001B" w:tentative="1">
+      <w:start w:val="1"/>
+      <w:numFmt w:val="lowerRoman"/>
+      <w:lvlText w:val="%9."/>
+      <w:lvlJc w:val="right"/>
+      <w:pPr>
+        <w:ind w:left="6480" w:hanging="180"/>
+      </w:pPr>
+    </w:lvl>
+  </w:abstractNum>
+  <w:abstractNum w:abstractNumId="10" w15:restartNumberingAfterBreak="0">
+    <w:nsid w:val="1F1C354F"/>
+    <w:multiLevelType w:val="hybridMultilevel"/>
+    <w:tmpl w:val="92A6934C"/>
+    <w:lvl w:ilvl="0" w:tplc="08090011">
+      <w:start w:val="1"/>
+      <w:numFmt w:val="decimal"/>
+      <w:lvlText w:val="%1)"/>
+      <w:lvlJc w:val="left"/>
+      <w:pPr>
+        <w:ind w:left="720" w:hanging="360"/>
+      </w:pPr>
+    </w:lvl>
+    <w:lvl w:ilvl="1" w:tplc="08090019" w:tentative="1">
+      <w:start w:val="1"/>
+      <w:numFmt w:val="lowerLetter"/>
+      <w:lvlText w:val="%2."/>
+      <w:lvlJc w:val="left"/>
+      <w:pPr>
+        <w:ind w:left="1440" w:hanging="360"/>
+      </w:pPr>
+    </w:lvl>
+    <w:lvl w:ilvl="2" w:tplc="0809001B" w:tentative="1">
+      <w:start w:val="1"/>
+      <w:numFmt w:val="lowerRoman"/>
+      <w:lvlText w:val="%3."/>
+      <w:lvlJc w:val="right"/>
+      <w:pPr>
+        <w:ind w:left="2160" w:hanging="180"/>
+      </w:pPr>
+    </w:lvl>
+    <w:lvl w:ilvl="3" w:tplc="0809000F" w:tentative="1">
+      <w:start w:val="1"/>
+      <w:numFmt w:val="decimal"/>
+      <w:lvlText w:val="%4."/>
+      <w:lvlJc w:val="left"/>
+      <w:pPr>
+        <w:ind w:left="2880" w:hanging="360"/>
+      </w:pPr>
+    </w:lvl>
+    <w:lvl w:ilvl="4" w:tplc="08090019" w:tentative="1">
+      <w:start w:val="1"/>
+      <w:numFmt w:val="lowerLetter"/>
+      <w:lvlText w:val="%5."/>
+      <w:lvlJc w:val="left"/>
+      <w:pPr>
+        <w:ind w:left="3600" w:hanging="360"/>
+      </w:pPr>
+    </w:lvl>
+    <w:lvl w:ilvl="5" w:tplc="0809001B" w:tentative="1">
+      <w:start w:val="1"/>
+      <w:numFmt w:val="lowerRoman"/>
+      <w:lvlText w:val="%6."/>
+      <w:lvlJc w:val="right"/>
+      <w:pPr>
+        <w:ind w:left="4320" w:hanging="180"/>
+      </w:pPr>
+    </w:lvl>
+    <w:lvl w:ilvl="6" w:tplc="0809000F" w:tentative="1">
+      <w:start w:val="1"/>
+      <w:numFmt w:val="decimal"/>
+      <w:lvlText w:val="%7."/>
+      <w:lvlJc w:val="left"/>
+      <w:pPr>
+        <w:ind w:left="5040" w:hanging="360"/>
+      </w:pPr>
+    </w:lvl>
+    <w:lvl w:ilvl="7" w:tplc="08090019" w:tentative="1">
+      <w:start w:val="1"/>
+      <w:numFmt w:val="lowerLetter"/>
+      <w:lvlText w:val="%8."/>
+      <w:lvlJc w:val="left"/>
+      <w:pPr>
+        <w:ind w:left="5760" w:hanging="360"/>
+      </w:pPr>
+    </w:lvl>
+    <w:lvl w:ilvl="8" w:tplc="0809001B" w:tentative="1">
+      <w:start w:val="1"/>
+      <w:numFmt w:val="lowerRoman"/>
+      <w:lvlText w:val="%9."/>
+      <w:lvlJc w:val="right"/>
+      <w:pPr>
+        <w:ind w:left="6480" w:hanging="180"/>
+      </w:pPr>
+    </w:lvl>
+  </w:abstractNum>
+  <w:abstractNum w:abstractNumId="11" w15:restartNumberingAfterBreak="0">
     <w:nsid w:val="207A2573"/>
     <w:multiLevelType w:val="multilevel"/>
     <w:tmpl w:val="BD760A94"/>
@@ -7547,6 +7455,318 @@
       <w:rPr>
         <w:rFonts w:ascii="Noto Sans Symbols" w:eastAsia="Noto Sans Symbols" w:hAnsi="Noto Sans Symbols" w:cs="Noto Sans Symbols"/>
       </w:rPr>
+    </w:lvl>
+  </w:abstractNum>
+  <w:abstractNum w:abstractNumId="12" w15:restartNumberingAfterBreak="0">
+    <w:nsid w:val="2A0300AC"/>
+    <w:multiLevelType w:val="hybridMultilevel"/>
+    <w:tmpl w:val="03BEE434"/>
+    <w:lvl w:ilvl="0" w:tplc="08090001">
+      <w:start w:val="1"/>
+      <w:numFmt w:val="bullet"/>
+      <w:lvlText w:val=""/>
+      <w:lvlJc w:val="left"/>
+      <w:pPr>
+        <w:ind w:left="720" w:hanging="360"/>
+      </w:pPr>
+      <w:rPr>
+        <w:rFonts w:ascii="Symbol" w:hAnsi="Symbol" w:hint="default"/>
+      </w:rPr>
+    </w:lvl>
+    <w:lvl w:ilvl="1" w:tplc="08090003" w:tentative="1">
+      <w:start w:val="1"/>
+      <w:numFmt w:val="bullet"/>
+      <w:lvlText w:val="o"/>
+      <w:lvlJc w:val="left"/>
+      <w:pPr>
+        <w:ind w:left="1440" w:hanging="360"/>
+      </w:pPr>
+      <w:rPr>
+        <w:rFonts w:ascii="Courier New" w:hAnsi="Courier New" w:cs="Courier New" w:hint="default"/>
+      </w:rPr>
+    </w:lvl>
+    <w:lvl w:ilvl="2" w:tplc="08090005" w:tentative="1">
+      <w:start w:val="1"/>
+      <w:numFmt w:val="bullet"/>
+      <w:lvlText w:val=""/>
+      <w:lvlJc w:val="left"/>
+      <w:pPr>
+        <w:ind w:left="2160" w:hanging="360"/>
+      </w:pPr>
+      <w:rPr>
+        <w:rFonts w:ascii="Wingdings" w:hAnsi="Wingdings" w:hint="default"/>
+      </w:rPr>
+    </w:lvl>
+    <w:lvl w:ilvl="3" w:tplc="08090001" w:tentative="1">
+      <w:start w:val="1"/>
+      <w:numFmt w:val="bullet"/>
+      <w:lvlText w:val=""/>
+      <w:lvlJc w:val="left"/>
+      <w:pPr>
+        <w:ind w:left="2880" w:hanging="360"/>
+      </w:pPr>
+      <w:rPr>
+        <w:rFonts w:ascii="Symbol" w:hAnsi="Symbol" w:hint="default"/>
+      </w:rPr>
+    </w:lvl>
+    <w:lvl w:ilvl="4" w:tplc="08090003" w:tentative="1">
+      <w:start w:val="1"/>
+      <w:numFmt w:val="bullet"/>
+      <w:lvlText w:val="o"/>
+      <w:lvlJc w:val="left"/>
+      <w:pPr>
+        <w:ind w:left="3600" w:hanging="360"/>
+      </w:pPr>
+      <w:rPr>
+        <w:rFonts w:ascii="Courier New" w:hAnsi="Courier New" w:cs="Courier New" w:hint="default"/>
+      </w:rPr>
+    </w:lvl>
+    <w:lvl w:ilvl="5" w:tplc="08090005" w:tentative="1">
+      <w:start w:val="1"/>
+      <w:numFmt w:val="bullet"/>
+      <w:lvlText w:val=""/>
+      <w:lvlJc w:val="left"/>
+      <w:pPr>
+        <w:ind w:left="4320" w:hanging="360"/>
+      </w:pPr>
+      <w:rPr>
+        <w:rFonts w:ascii="Wingdings" w:hAnsi="Wingdings" w:hint="default"/>
+      </w:rPr>
+    </w:lvl>
+    <w:lvl w:ilvl="6" w:tplc="08090001" w:tentative="1">
+      <w:start w:val="1"/>
+      <w:numFmt w:val="bullet"/>
+      <w:lvlText w:val=""/>
+      <w:lvlJc w:val="left"/>
+      <w:pPr>
+        <w:ind w:left="5040" w:hanging="360"/>
+      </w:pPr>
+      <w:rPr>
+        <w:rFonts w:ascii="Symbol" w:hAnsi="Symbol" w:hint="default"/>
+      </w:rPr>
+    </w:lvl>
+    <w:lvl w:ilvl="7" w:tplc="08090003" w:tentative="1">
+      <w:start w:val="1"/>
+      <w:numFmt w:val="bullet"/>
+      <w:lvlText w:val="o"/>
+      <w:lvlJc w:val="left"/>
+      <w:pPr>
+        <w:ind w:left="5760" w:hanging="360"/>
+      </w:pPr>
+      <w:rPr>
+        <w:rFonts w:ascii="Courier New" w:hAnsi="Courier New" w:cs="Courier New" w:hint="default"/>
+      </w:rPr>
+    </w:lvl>
+    <w:lvl w:ilvl="8" w:tplc="08090005" w:tentative="1">
+      <w:start w:val="1"/>
+      <w:numFmt w:val="bullet"/>
+      <w:lvlText w:val=""/>
+      <w:lvlJc w:val="left"/>
+      <w:pPr>
+        <w:ind w:left="6480" w:hanging="360"/>
+      </w:pPr>
+      <w:rPr>
+        <w:rFonts w:ascii="Wingdings" w:hAnsi="Wingdings" w:hint="default"/>
+      </w:rPr>
+    </w:lvl>
+  </w:abstractNum>
+  <w:abstractNum w:abstractNumId="13" w15:restartNumberingAfterBreak="0">
+    <w:nsid w:val="37A56C16"/>
+    <w:multiLevelType w:val="hybridMultilevel"/>
+    <w:tmpl w:val="D3D2BC96"/>
+    <w:lvl w:ilvl="0" w:tplc="08090011">
+      <w:start w:val="1"/>
+      <w:numFmt w:val="decimal"/>
+      <w:lvlText w:val="%1)"/>
+      <w:lvlJc w:val="left"/>
+      <w:pPr>
+        <w:ind w:left="720" w:hanging="360"/>
+      </w:pPr>
+      <w:rPr>
+        <w:rFonts w:hint="default"/>
+      </w:rPr>
+    </w:lvl>
+    <w:lvl w:ilvl="1" w:tplc="FFFFFFFF" w:tentative="1">
+      <w:start w:val="1"/>
+      <w:numFmt w:val="bullet"/>
+      <w:lvlText w:val="o"/>
+      <w:lvlJc w:val="left"/>
+      <w:pPr>
+        <w:ind w:left="1440" w:hanging="360"/>
+      </w:pPr>
+      <w:rPr>
+        <w:rFonts w:ascii="Courier New" w:hAnsi="Courier New" w:cs="Courier New" w:hint="default"/>
+      </w:rPr>
+    </w:lvl>
+    <w:lvl w:ilvl="2" w:tplc="FFFFFFFF" w:tentative="1">
+      <w:start w:val="1"/>
+      <w:numFmt w:val="bullet"/>
+      <w:lvlText w:val=""/>
+      <w:lvlJc w:val="left"/>
+      <w:pPr>
+        <w:ind w:left="2160" w:hanging="360"/>
+      </w:pPr>
+      <w:rPr>
+        <w:rFonts w:ascii="Wingdings" w:hAnsi="Wingdings" w:hint="default"/>
+      </w:rPr>
+    </w:lvl>
+    <w:lvl w:ilvl="3" w:tplc="FFFFFFFF" w:tentative="1">
+      <w:start w:val="1"/>
+      <w:numFmt w:val="bullet"/>
+      <w:lvlText w:val=""/>
+      <w:lvlJc w:val="left"/>
+      <w:pPr>
+        <w:ind w:left="2880" w:hanging="360"/>
+      </w:pPr>
+      <w:rPr>
+        <w:rFonts w:ascii="Symbol" w:hAnsi="Symbol" w:hint="default"/>
+      </w:rPr>
+    </w:lvl>
+    <w:lvl w:ilvl="4" w:tplc="FFFFFFFF" w:tentative="1">
+      <w:start w:val="1"/>
+      <w:numFmt w:val="bullet"/>
+      <w:lvlText w:val="o"/>
+      <w:lvlJc w:val="left"/>
+      <w:pPr>
+        <w:ind w:left="3600" w:hanging="360"/>
+      </w:pPr>
+      <w:rPr>
+        <w:rFonts w:ascii="Courier New" w:hAnsi="Courier New" w:cs="Courier New" w:hint="default"/>
+      </w:rPr>
+    </w:lvl>
+    <w:lvl w:ilvl="5" w:tplc="FFFFFFFF" w:tentative="1">
+      <w:start w:val="1"/>
+      <w:numFmt w:val="bullet"/>
+      <w:lvlText w:val=""/>
+      <w:lvlJc w:val="left"/>
+      <w:pPr>
+        <w:ind w:left="4320" w:hanging="360"/>
+      </w:pPr>
+      <w:rPr>
+        <w:rFonts w:ascii="Wingdings" w:hAnsi="Wingdings" w:hint="default"/>
+      </w:rPr>
+    </w:lvl>
+    <w:lvl w:ilvl="6" w:tplc="FFFFFFFF" w:tentative="1">
+      <w:start w:val="1"/>
+      <w:numFmt w:val="bullet"/>
+      <w:lvlText w:val=""/>
+      <w:lvlJc w:val="left"/>
+      <w:pPr>
+        <w:ind w:left="5040" w:hanging="360"/>
+      </w:pPr>
+      <w:rPr>
+        <w:rFonts w:ascii="Symbol" w:hAnsi="Symbol" w:hint="default"/>
+      </w:rPr>
+    </w:lvl>
+    <w:lvl w:ilvl="7" w:tplc="FFFFFFFF" w:tentative="1">
+      <w:start w:val="1"/>
+      <w:numFmt w:val="bullet"/>
+      <w:lvlText w:val="o"/>
+      <w:lvlJc w:val="left"/>
+      <w:pPr>
+        <w:ind w:left="5760" w:hanging="360"/>
+      </w:pPr>
+      <w:rPr>
+        <w:rFonts w:ascii="Courier New" w:hAnsi="Courier New" w:cs="Courier New" w:hint="default"/>
+      </w:rPr>
+    </w:lvl>
+    <w:lvl w:ilvl="8" w:tplc="FFFFFFFF" w:tentative="1">
+      <w:start w:val="1"/>
+      <w:numFmt w:val="bullet"/>
+      <w:lvlText w:val=""/>
+      <w:lvlJc w:val="left"/>
+      <w:pPr>
+        <w:ind w:left="6480" w:hanging="360"/>
+      </w:pPr>
+      <w:rPr>
+        <w:rFonts w:ascii="Wingdings" w:hAnsi="Wingdings" w:hint="default"/>
+      </w:rPr>
+    </w:lvl>
+  </w:abstractNum>
+  <w:abstractNum w:abstractNumId="14" w15:restartNumberingAfterBreak="0">
+    <w:nsid w:val="6481671F"/>
+    <w:multiLevelType w:val="hybridMultilevel"/>
+    <w:tmpl w:val="C23E7AD2"/>
+    <w:lvl w:ilvl="0" w:tplc="08090011">
+      <w:start w:val="1"/>
+      <w:numFmt w:val="decimal"/>
+      <w:lvlText w:val="%1)"/>
+      <w:lvlJc w:val="left"/>
+      <w:pPr>
+        <w:ind w:left="720" w:hanging="360"/>
+      </w:pPr>
+    </w:lvl>
+    <w:lvl w:ilvl="1" w:tplc="08090019" w:tentative="1">
+      <w:start w:val="1"/>
+      <w:numFmt w:val="lowerLetter"/>
+      <w:lvlText w:val="%2."/>
+      <w:lvlJc w:val="left"/>
+      <w:pPr>
+        <w:ind w:left="1440" w:hanging="360"/>
+      </w:pPr>
+    </w:lvl>
+    <w:lvl w:ilvl="2" w:tplc="0809001B" w:tentative="1">
+      <w:start w:val="1"/>
+      <w:numFmt w:val="lowerRoman"/>
+      <w:lvlText w:val="%3."/>
+      <w:lvlJc w:val="right"/>
+      <w:pPr>
+        <w:ind w:left="2160" w:hanging="180"/>
+      </w:pPr>
+    </w:lvl>
+    <w:lvl w:ilvl="3" w:tplc="0809000F" w:tentative="1">
+      <w:start w:val="1"/>
+      <w:numFmt w:val="decimal"/>
+      <w:lvlText w:val="%4."/>
+      <w:lvlJc w:val="left"/>
+      <w:pPr>
+        <w:ind w:left="2880" w:hanging="360"/>
+      </w:pPr>
+    </w:lvl>
+    <w:lvl w:ilvl="4" w:tplc="08090019" w:tentative="1">
+      <w:start w:val="1"/>
+      <w:numFmt w:val="lowerLetter"/>
+      <w:lvlText w:val="%5."/>
+      <w:lvlJc w:val="left"/>
+      <w:pPr>
+        <w:ind w:left="3600" w:hanging="360"/>
+      </w:pPr>
+    </w:lvl>
+    <w:lvl w:ilvl="5" w:tplc="0809001B" w:tentative="1">
+      <w:start w:val="1"/>
+      <w:numFmt w:val="lowerRoman"/>
+      <w:lvlText w:val="%6."/>
+      <w:lvlJc w:val="right"/>
+      <w:pPr>
+        <w:ind w:left="4320" w:hanging="180"/>
+      </w:pPr>
+    </w:lvl>
+    <w:lvl w:ilvl="6" w:tplc="0809000F" w:tentative="1">
+      <w:start w:val="1"/>
+      <w:numFmt w:val="decimal"/>
+      <w:lvlText w:val="%7."/>
+      <w:lvlJc w:val="left"/>
+      <w:pPr>
+        <w:ind w:left="5040" w:hanging="360"/>
+      </w:pPr>
+    </w:lvl>
+    <w:lvl w:ilvl="7" w:tplc="08090019" w:tentative="1">
+      <w:start w:val="1"/>
+      <w:numFmt w:val="lowerLetter"/>
+      <w:lvlText w:val="%8."/>
+      <w:lvlJc w:val="left"/>
+      <w:pPr>
+        <w:ind w:left="5760" w:hanging="360"/>
+      </w:pPr>
+    </w:lvl>
+    <w:lvl w:ilvl="8" w:tplc="0809001B" w:tentative="1">
+      <w:start w:val="1"/>
+      <w:numFmt w:val="lowerRoman"/>
+      <w:lvlText w:val="%9."/>
+      <w:lvlJc w:val="right"/>
+      <w:pPr>
+        <w:ind w:left="6480" w:hanging="180"/>
+      </w:pPr>
     </w:lvl>
   </w:abstractNum>
   <w:num w:numId="1" w16cid:durableId="1965309733">
@@ -7577,7 +7797,22 @@
     <w:abstractNumId w:val="0"/>
   </w:num>
   <w:num w:numId="10" w16cid:durableId="660163193">
+    <w:abstractNumId w:val="11"/>
+  </w:num>
+  <w:num w:numId="11" w16cid:durableId="294063685">
+    <w:abstractNumId w:val="12"/>
+  </w:num>
+  <w:num w:numId="12" w16cid:durableId="1730029843">
+    <w:abstractNumId w:val="13"/>
+  </w:num>
+  <w:num w:numId="13" w16cid:durableId="373769414">
+    <w:abstractNumId w:val="10"/>
+  </w:num>
+  <w:num w:numId="14" w16cid:durableId="883445284">
     <w:abstractNumId w:val="9"/>
+  </w:num>
+  <w:num w:numId="15" w16cid:durableId="1304772140">
+    <w:abstractNumId w:val="14"/>
   </w:num>
 </w:numbering>
 </file>

</xml_diff>